<commit_message>
docs: update implementation plan, mark prompts done, add strategy docs
- Update Master Implementation Plan.docx with latest progress
- Mark prompts 7.3, 7.4, 8.1, 8.2, 8.3 as Done (renamed)
- Add Content Strategy.docx
- Add Production Implementation Hosting.docx

Co-Authored-By: Claude Sonnet 4.6 <noreply@anthropic.com>
</commit_message>
<xml_diff>
--- a/Documentation/Master Implementation Plan.docx
+++ b/Documentation/Master Implementation Plan.docx
@@ -2959,7 +2959,7 @@
           <w:bCs/>
         </w:rPr>
         <w:pict w14:anchorId="42702F26">
-          <v:rect id="_x0000_i1406" style="width:0;height:1.5pt" o:hralign="center" o:hrstd="t" o:hr="t" fillcolor="#a0a0a0" stroked="f"/>
+          <v:rect id="_x0000_i1057" style="width:0;height:1.5pt" o:hralign="center" o:hrstd="t" o:hr="t" fillcolor="#a0a0a0" stroked="f"/>
         </w:pict>
       </w:r>
     </w:p>
@@ -3114,7 +3114,7 @@
           <w:bCs/>
         </w:rPr>
         <w:pict w14:anchorId="64CD9D4B">
-          <v:rect id="_x0000_i1407" style="width:0;height:1.5pt" o:hralign="center" o:hrstd="t" o:hr="t" fillcolor="#a0a0a0" stroked="f"/>
+          <v:rect id="_x0000_i1058" style="width:0;height:1.5pt" o:hralign="center" o:hrstd="t" o:hr="t" fillcolor="#a0a0a0" stroked="f"/>
         </w:pict>
       </w:r>
     </w:p>
@@ -3315,7 +3315,7 @@
           <w:bCs/>
         </w:rPr>
         <w:pict w14:anchorId="3F1833F1">
-          <v:rect id="_x0000_i1408" style="width:0;height:1.5pt" o:hralign="center" o:hrstd="t" o:hr="t" fillcolor="#a0a0a0" stroked="f"/>
+          <v:rect id="_x0000_i1059" style="width:0;height:1.5pt" o:hralign="center" o:hrstd="t" o:hr="t" fillcolor="#a0a0a0" stroked="f"/>
         </w:pict>
       </w:r>
     </w:p>
@@ -3506,7 +3506,7 @@
           <w:bCs/>
         </w:rPr>
         <w:pict w14:anchorId="1E8D7B65">
-          <v:rect id="_x0000_i1409" style="width:0;height:1.5pt" o:hralign="center" o:hrstd="t" o:hr="t" fillcolor="#a0a0a0" stroked="f"/>
+          <v:rect id="_x0000_i1060" style="width:0;height:1.5pt" o:hralign="center" o:hrstd="t" o:hr="t" fillcolor="#a0a0a0" stroked="f"/>
         </w:pict>
       </w:r>
     </w:p>
@@ -3598,7 +3598,7 @@
           <w:bCs/>
         </w:rPr>
         <w:pict w14:anchorId="34C3992D">
-          <v:rect id="_x0000_i1410" style="width:0;height:1.5pt" o:hralign="center" o:hrstd="t" o:hr="t" fillcolor="#a0a0a0" stroked="f"/>
+          <v:rect id="_x0000_i1061" style="width:0;height:1.5pt" o:hralign="center" o:hrstd="t" o:hr="t" fillcolor="#a0a0a0" stroked="f"/>
         </w:pict>
       </w:r>
     </w:p>
@@ -3784,7 +3784,7 @@
           <w:bCs/>
         </w:rPr>
         <w:pict w14:anchorId="4ED811C3">
-          <v:rect id="_x0000_i1411" style="width:0;height:1.5pt" o:hralign="center" o:hrstd="t" o:hr="t" fillcolor="#a0a0a0" stroked="f"/>
+          <v:rect id="_x0000_i1062" style="width:0;height:1.5pt" o:hralign="center" o:hrstd="t" o:hr="t" fillcolor="#a0a0a0" stroked="f"/>
         </w:pict>
       </w:r>
     </w:p>
@@ -3921,7 +3921,7 @@
           <w:bCs/>
         </w:rPr>
         <w:pict w14:anchorId="522E4B71">
-          <v:rect id="_x0000_i1412" style="width:0;height:1.5pt" o:hralign="center" o:hrstd="t" o:hr="t" fillcolor="#a0a0a0" stroked="f"/>
+          <v:rect id="_x0000_i1063" style="width:0;height:1.5pt" o:hralign="center" o:hrstd="t" o:hr="t" fillcolor="#a0a0a0" stroked="f"/>
         </w:pict>
       </w:r>
     </w:p>
@@ -4058,7 +4058,7 @@
           <w:bCs/>
         </w:rPr>
         <w:pict w14:anchorId="55111394">
-          <v:rect id="_x0000_i1413" style="width:0;height:1.5pt" o:hralign="center" o:hrstd="t" o:hr="t" fillcolor="#a0a0a0" stroked="f"/>
+          <v:rect id="_x0000_i1064" style="width:0;height:1.5pt" o:hralign="center" o:hrstd="t" o:hr="t" fillcolor="#a0a0a0" stroked="f"/>
         </w:pict>
       </w:r>
     </w:p>
@@ -4177,7 +4177,7 @@
           <w:bCs/>
         </w:rPr>
         <w:pict w14:anchorId="0B28F354">
-          <v:rect id="_x0000_i1414" style="width:0;height:1.5pt" o:hralign="center" o:hrstd="t" o:hr="t" fillcolor="#a0a0a0" stroked="f"/>
+          <v:rect id="_x0000_i1065" style="width:0;height:1.5pt" o:hralign="center" o:hrstd="t" o:hr="t" fillcolor="#a0a0a0" stroked="f"/>
         </w:pict>
       </w:r>
     </w:p>
@@ -4215,7 +4215,7 @@
           <w:bCs/>
         </w:rPr>
         <w:pict w14:anchorId="3D0B99D5">
-          <v:rect id="_x0000_i1415" style="width:0;height:1.5pt" o:hralign="center" o:hrstd="t" o:hr="t" fillcolor="#a0a0a0" stroked="f"/>
+          <v:rect id="_x0000_i1066" style="width:0;height:1.5pt" o:hralign="center" o:hrstd="t" o:hr="t" fillcolor="#a0a0a0" stroked="f"/>
         </w:pict>
       </w:r>
     </w:p>
@@ -4432,7 +4432,7 @@
           <w:bCs/>
         </w:rPr>
         <w:pict w14:anchorId="011962B0">
-          <v:rect id="_x0000_i1416" style="width:0;height:1.5pt" o:hralign="center" o:hrstd="t" o:hr="t" fillcolor="#a0a0a0" stroked="f"/>
+          <v:rect id="_x0000_i1067" style="width:0;height:1.5pt" o:hralign="center" o:hrstd="t" o:hr="t" fillcolor="#a0a0a0" stroked="f"/>
         </w:pict>
       </w:r>
     </w:p>
@@ -4578,7 +4578,7 @@
           <w:bCs/>
         </w:rPr>
         <w:pict w14:anchorId="45EBB967">
-          <v:rect id="_x0000_i1417" style="width:0;height:1.5pt" o:hralign="center" o:hrstd="t" o:hr="t" fillcolor="#a0a0a0" stroked="f"/>
+          <v:rect id="_x0000_i1068" style="width:0;height:1.5pt" o:hralign="center" o:hrstd="t" o:hr="t" fillcolor="#a0a0a0" stroked="f"/>
         </w:pict>
       </w:r>
     </w:p>
@@ -4724,7 +4724,7 @@
           <w:bCs/>
         </w:rPr>
         <w:pict w14:anchorId="7F34787C">
-          <v:rect id="_x0000_i1418" style="width:0;height:1.5pt" o:hralign="center" o:hrstd="t" o:hr="t" fillcolor="#a0a0a0" stroked="f"/>
+          <v:rect id="_x0000_i1069" style="width:0;height:1.5pt" o:hralign="center" o:hrstd="t" o:hr="t" fillcolor="#a0a0a0" stroked="f"/>
         </w:pict>
       </w:r>
     </w:p>
@@ -4862,7 +4862,7 @@
           <w:bCs/>
         </w:rPr>
         <w:pict w14:anchorId="1AFF3113">
-          <v:rect id="_x0000_i1419" style="width:0;height:1.5pt" o:hralign="center" o:hrstd="t" o:hr="t" fillcolor="#a0a0a0" stroked="f"/>
+          <v:rect id="_x0000_i1070" style="width:0;height:1.5pt" o:hralign="center" o:hrstd="t" o:hr="t" fillcolor="#a0a0a0" stroked="f"/>
         </w:pict>
       </w:r>
     </w:p>
@@ -4900,7 +4900,7 @@
           <w:bCs/>
         </w:rPr>
         <w:pict w14:anchorId="4B0A5B7A">
-          <v:rect id="_x0000_i1420" style="width:0;height:1.5pt" o:hralign="center" o:hrstd="t" o:hr="t" fillcolor="#a0a0a0" stroked="f"/>
+          <v:rect id="_x0000_i1071" style="width:0;height:1.5pt" o:hralign="center" o:hrstd="t" o:hr="t" fillcolor="#a0a0a0" stroked="f"/>
         </w:pict>
       </w:r>
     </w:p>
@@ -4992,7 +4992,7 @@
           <w:bCs/>
         </w:rPr>
         <w:pict w14:anchorId="67642C49">
-          <v:rect id="_x0000_i1421" style="width:0;height:1.5pt" o:hralign="center" o:hrstd="t" o:hr="t" fillcolor="#a0a0a0" stroked="f"/>
+          <v:rect id="_x0000_i1072" style="width:0;height:1.5pt" o:hralign="center" o:hrstd="t" o:hr="t" fillcolor="#a0a0a0" stroked="f"/>
         </w:pict>
       </w:r>
     </w:p>
@@ -5084,7 +5084,7 @@
           <w:bCs/>
         </w:rPr>
         <w:pict w14:anchorId="0903EBFA">
-          <v:rect id="_x0000_i1422" style="width:0;height:1.5pt" o:hralign="center" o:hrstd="t" o:hr="t" fillcolor="#a0a0a0" stroked="f"/>
+          <v:rect id="_x0000_i1073" style="width:0;height:1.5pt" o:hralign="center" o:hrstd="t" o:hr="t" fillcolor="#a0a0a0" stroked="f"/>
         </w:pict>
       </w:r>
     </w:p>
@@ -5176,7 +5176,7 @@
           <w:bCs/>
         </w:rPr>
         <w:pict w14:anchorId="7680882B">
-          <v:rect id="_x0000_i1423" style="width:0;height:1.5pt" o:hralign="center" o:hrstd="t" o:hr="t" fillcolor="#a0a0a0" stroked="f"/>
+          <v:rect id="_x0000_i1074" style="width:0;height:1.5pt" o:hralign="center" o:hrstd="t" o:hr="t" fillcolor="#a0a0a0" stroked="f"/>
         </w:pict>
       </w:r>
     </w:p>
@@ -5214,7 +5214,7 @@
           <w:bCs/>
         </w:rPr>
         <w:pict w14:anchorId="3BF4DC39">
-          <v:rect id="_x0000_i1424" style="width:0;height:1.5pt" o:hralign="center" o:hrstd="t" o:hr="t" fillcolor="#a0a0a0" stroked="f"/>
+          <v:rect id="_x0000_i1075" style="width:0;height:1.5pt" o:hralign="center" o:hrstd="t" o:hr="t" fillcolor="#a0a0a0" stroked="f"/>
         </w:pict>
       </w:r>
     </w:p>
@@ -5306,7 +5306,7 @@
           <w:bCs/>
         </w:rPr>
         <w:pict w14:anchorId="3BB14143">
-          <v:rect id="_x0000_i1425" style="width:0;height:1.5pt" o:hralign="center" o:hrstd="t" o:hr="t" fillcolor="#a0a0a0" stroked="f"/>
+          <v:rect id="_x0000_i1076" style="width:0;height:1.5pt" o:hralign="center" o:hrstd="t" o:hr="t" fillcolor="#a0a0a0" stroked="f"/>
         </w:pict>
       </w:r>
     </w:p>
@@ -5399,7 +5399,7 @@
           <w:bCs/>
         </w:rPr>
         <w:pict w14:anchorId="1A2176EB">
-          <v:rect id="_x0000_i1426" style="width:0;height:1.5pt" o:hralign="center" o:hrstd="t" o:hr="t" fillcolor="#a0a0a0" stroked="f"/>
+          <v:rect id="_x0000_i1077" style="width:0;height:1.5pt" o:hralign="center" o:hrstd="t" o:hr="t" fillcolor="#a0a0a0" stroked="f"/>
         </w:pict>
       </w:r>
     </w:p>
@@ -5491,7 +5491,7 @@
           <w:bCs/>
         </w:rPr>
         <w:pict w14:anchorId="10DBC51B">
-          <v:rect id="_x0000_i1427" style="width:0;height:1.5pt" o:hralign="center" o:hrstd="t" o:hr="t" fillcolor="#a0a0a0" stroked="f"/>
+          <v:rect id="_x0000_i1078" style="width:0;height:1.5pt" o:hralign="center" o:hrstd="t" o:hr="t" fillcolor="#a0a0a0" stroked="f"/>
         </w:pict>
       </w:r>
     </w:p>
@@ -5510,26 +5510,26 @@
           <w:b/>
           <w:bCs/>
         </w:rPr>
-        <w:t>📈 PHASE 10 — USER ADOPTION &amp; GROWTH</w:t>
-      </w:r>
-    </w:p>
-    <w:p>
-      <w:pPr>
-        <w:spacing w:after="0"/>
-        <w:rPr>
-          <w:rFonts w:ascii="Segoe UI Emoji" w:hAnsi="Segoe UI Emoji" w:cs="Segoe UI Emoji"/>
-          <w:b/>
-          <w:bCs/>
-        </w:rPr>
-      </w:pPr>
-      <w:r>
-        <w:rPr>
-          <w:rFonts w:ascii="Segoe UI Emoji" w:hAnsi="Segoe UI Emoji" w:cs="Segoe UI Emoji"/>
-          <w:b/>
-          <w:bCs/>
-        </w:rPr>
-        <w:pict w14:anchorId="5A2544F8">
-          <v:rect id="_x0000_i1428" style="width:0;height:1.5pt" o:hralign="center" o:hrstd="t" o:hr="t" fillcolor="#a0a0a0" stroked="f"/>
+        <w:t xml:space="preserve">📈 PHASE 11 — USER ADOPTION &amp; GROWTH (Acquisition + Funnel Foundation) </w:t>
+      </w:r>
+    </w:p>
+    <w:p>
+      <w:pPr>
+        <w:spacing w:after="0"/>
+        <w:rPr>
+          <w:rFonts w:ascii="Segoe UI Emoji" w:hAnsi="Segoe UI Emoji" w:cs="Segoe UI Emoji"/>
+          <w:b/>
+          <w:bCs/>
+        </w:rPr>
+      </w:pPr>
+      <w:r>
+        <w:rPr>
+          <w:rFonts w:ascii="Segoe UI Emoji" w:hAnsi="Segoe UI Emoji" w:cs="Segoe UI Emoji"/>
+          <w:b/>
+          <w:bCs/>
+        </w:rPr>
+        <w:pict w14:anchorId="0FCE80D6">
+          <v:rect id="_x0000_i1358" style="width:0;height:1.5pt" o:hralign="center" o:hrstd="t" o:hr="t" fillcolor="#a0a0a0" stroked="f"/>
         </w:pict>
       </w:r>
     </w:p>
@@ -5548,43 +5548,25 @@
           <w:b/>
           <w:bCs/>
         </w:rPr>
-        <w:t>🔹 Feature 10.1 — Landing Page &amp; Marketing</w:t>
-      </w:r>
-    </w:p>
-    <w:p>
-      <w:pPr>
-        <w:spacing w:after="0"/>
-        <w:rPr>
-          <w:rFonts w:ascii="Segoe UI Emoji" w:hAnsi="Segoe UI Emoji" w:cs="Segoe UI Emoji"/>
-          <w:b/>
-          <w:bCs/>
-        </w:rPr>
-      </w:pPr>
-      <w:r>
-        <w:rPr>
-          <w:rFonts w:ascii="Segoe UI Emoji" w:hAnsi="Segoe UI Emoji" w:cs="Segoe UI Emoji"/>
-          <w:b/>
-          <w:bCs/>
-        </w:rPr>
-        <w:t>Task 10.1.1 — Conversion Funnel</w:t>
-      </w:r>
-    </w:p>
-    <w:p>
-      <w:pPr>
-        <w:spacing w:after="0"/>
-        <w:rPr>
-          <w:rFonts w:ascii="Segoe UI Emoji" w:hAnsi="Segoe UI Emoji" w:cs="Segoe UI Emoji"/>
-          <w:b/>
-          <w:bCs/>
-        </w:rPr>
-      </w:pPr>
-      <w:r>
-        <w:rPr>
-          <w:rFonts w:ascii="Segoe UI Emoji" w:hAnsi="Segoe UI Emoji" w:cs="Segoe UI Emoji"/>
-          <w:b/>
-          <w:bCs/>
-        </w:rPr>
-        <w:t>• Step 10.1.1.1 — Build landing page</w:t>
+        <w:t>🔹 Feature 11.1 — Landing Page &amp; Marketing</w:t>
+      </w:r>
+    </w:p>
+    <w:p>
+      <w:pPr>
+        <w:spacing w:after="0"/>
+        <w:rPr>
+          <w:rFonts w:ascii="Segoe UI Emoji" w:hAnsi="Segoe UI Emoji" w:cs="Segoe UI Emoji"/>
+          <w:b/>
+          <w:bCs/>
+        </w:rPr>
+      </w:pPr>
+      <w:r>
+        <w:rPr>
+          <w:rFonts w:ascii="Segoe UI Emoji" w:hAnsi="Segoe UI Emoji" w:cs="Segoe UI Emoji"/>
+          <w:b/>
+          <w:bCs/>
+        </w:rPr>
+        <w:t>Task 11.1.1 — Conversion Funnel (Core Revenue Engine)</w:t>
       </w:r>
       <w:r>
         <w:rPr>
@@ -5593,7 +5575,7 @@
           <w:bCs/>
         </w:rPr>
         <w:br/>
-        <w:t>• Step 10.1.1.2 — Value proposition clarity</w:t>
+        <w:t>• Step 11.1.1.1 — Build high-converting landing page (single CTA: “Get your plan”)</w:t>
       </w:r>
       <w:r>
         <w:rPr>
@@ -5602,26 +5584,241 @@
           <w:bCs/>
         </w:rPr>
         <w:br/>
-        <w:t>• Step 10.1.1.3 — Add testimonials</w:t>
-      </w:r>
-    </w:p>
-    <w:p>
-      <w:pPr>
-        <w:spacing w:after="0"/>
-        <w:rPr>
-          <w:rFonts w:ascii="Segoe UI Emoji" w:hAnsi="Segoe UI Emoji" w:cs="Segoe UI Emoji"/>
-          <w:b/>
-          <w:bCs/>
-        </w:rPr>
-      </w:pPr>
-      <w:r>
-        <w:rPr>
-          <w:rFonts w:ascii="Segoe UI Emoji" w:hAnsi="Segoe UI Emoji" w:cs="Segoe UI Emoji"/>
-          <w:b/>
-          <w:bCs/>
-        </w:rPr>
-        <w:pict w14:anchorId="62D3C5B8">
-          <v:rect id="_x0000_i1429" style="width:0;height:1.5pt" o:hralign="center" o:hrstd="t" o:hr="t" fillcolor="#a0a0a0" stroked="f"/>
+        <w:t>• Step 11.1.1.2 — Implement 3–5 step onboarding input (no signup wall)</w:t>
+      </w:r>
+      <w:r>
+        <w:rPr>
+          <w:rFonts w:ascii="Segoe UI Emoji" w:hAnsi="Segoe UI Emoji" w:cs="Segoe UI Emoji"/>
+          <w:b/>
+          <w:bCs/>
+        </w:rPr>
+        <w:br/>
+        <w:t>• Step 11.1.1.3 — Generate partial plan (calories/macros preview)</w:t>
+      </w:r>
+      <w:r>
+        <w:rPr>
+          <w:rFonts w:ascii="Segoe UI Emoji" w:hAnsi="Segoe UI Emoji" w:cs="Segoe UI Emoji"/>
+          <w:b/>
+          <w:bCs/>
+        </w:rPr>
+        <w:br/>
+        <w:t>• Step 11.1.1.4 — Lock full plan behind paywall (meals, timeline, coaching)</w:t>
+      </w:r>
+      <w:r>
+        <w:rPr>
+          <w:rFonts w:ascii="Segoe UI Emoji" w:hAnsi="Segoe UI Emoji" w:cs="Segoe UI Emoji"/>
+          <w:b/>
+          <w:bCs/>
+        </w:rPr>
+        <w:br/>
+        <w:t>• Step 11.1.1.5 — Add urgency triggers (time-based / session-based)</w:t>
+      </w:r>
+      <w:r>
+        <w:rPr>
+          <w:rFonts w:ascii="Segoe UI Emoji" w:hAnsi="Segoe UI Emoji" w:cs="Segoe UI Emoji"/>
+          <w:b/>
+          <w:bCs/>
+        </w:rPr>
+        <w:br/>
+        <w:t>• Step 11.1.1.6 — Add personalization hooks (name, goal, weight)</w:t>
+      </w:r>
+    </w:p>
+    <w:p>
+      <w:pPr>
+        <w:spacing w:after="0"/>
+        <w:rPr>
+          <w:rFonts w:ascii="Segoe UI Emoji" w:hAnsi="Segoe UI Emoji" w:cs="Segoe UI Emoji"/>
+          <w:b/>
+          <w:bCs/>
+        </w:rPr>
+      </w:pPr>
+      <w:r>
+        <w:rPr>
+          <w:rFonts w:ascii="Segoe UI Emoji" w:hAnsi="Segoe UI Emoji" w:cs="Segoe UI Emoji"/>
+          <w:b/>
+          <w:bCs/>
+        </w:rPr>
+        <w:t>Task 11.1.2 — Value Proposition Optimization</w:t>
+      </w:r>
+      <w:r>
+        <w:rPr>
+          <w:rFonts w:ascii="Segoe UI Emoji" w:hAnsi="Segoe UI Emoji" w:cs="Segoe UI Emoji"/>
+          <w:b/>
+          <w:bCs/>
+        </w:rPr>
+        <w:br/>
+        <w:t>• Step 11.1.2.1 — Define primary positioning (“AI Metabolic Coach”)</w:t>
+      </w:r>
+      <w:r>
+        <w:rPr>
+          <w:rFonts w:ascii="Segoe UI Emoji" w:hAnsi="Segoe UI Emoji" w:cs="Segoe UI Emoji"/>
+          <w:b/>
+          <w:bCs/>
+        </w:rPr>
+        <w:br/>
+        <w:t>• Step 11.1.2.2 — Add outcome-driven sub-headline</w:t>
+      </w:r>
+      <w:r>
+        <w:rPr>
+          <w:rFonts w:ascii="Segoe UI Emoji" w:hAnsi="Segoe UI Emoji" w:cs="Segoe UI Emoji"/>
+          <w:b/>
+          <w:bCs/>
+        </w:rPr>
+        <w:br/>
+        <w:t>• Step 11.1.2.3 — Add cost comparison ($9 vs nutritionist)</w:t>
+      </w:r>
+      <w:r>
+        <w:rPr>
+          <w:rFonts w:ascii="Segoe UI Emoji" w:hAnsi="Segoe UI Emoji" w:cs="Segoe UI Emoji"/>
+          <w:b/>
+          <w:bCs/>
+        </w:rPr>
+        <w:br/>
+        <w:t>• Step 11.1.2.4 — A/B test messaging variants</w:t>
+      </w:r>
+    </w:p>
+    <w:p>
+      <w:pPr>
+        <w:spacing w:after="0"/>
+        <w:rPr>
+          <w:rFonts w:ascii="Segoe UI Emoji" w:hAnsi="Segoe UI Emoji" w:cs="Segoe UI Emoji"/>
+          <w:b/>
+          <w:bCs/>
+        </w:rPr>
+      </w:pPr>
+      <w:r>
+        <w:rPr>
+          <w:rFonts w:ascii="Segoe UI Emoji" w:hAnsi="Segoe UI Emoji" w:cs="Segoe UI Emoji"/>
+          <w:b/>
+          <w:bCs/>
+        </w:rPr>
+        <w:t>Task 11.1.3 — Social Proof &amp; Trust Signals</w:t>
+      </w:r>
+      <w:r>
+        <w:rPr>
+          <w:rFonts w:ascii="Segoe UI Emoji" w:hAnsi="Segoe UI Emoji" w:cs="Segoe UI Emoji"/>
+          <w:b/>
+          <w:bCs/>
+        </w:rPr>
+        <w:br/>
+        <w:t>• Step 11.1.3.1 — Add testimonials (early users / synthetic if needed)</w:t>
+      </w:r>
+      <w:r>
+        <w:rPr>
+          <w:rFonts w:ascii="Segoe UI Emoji" w:hAnsi="Segoe UI Emoji" w:cs="Segoe UI Emoji"/>
+          <w:b/>
+          <w:bCs/>
+        </w:rPr>
+        <w:br/>
+        <w:t>• Step 11.1.3.2 — Add transformation-style examples</w:t>
+      </w:r>
+      <w:r>
+        <w:rPr>
+          <w:rFonts w:ascii="Segoe UI Emoji" w:hAnsi="Segoe UI Emoji" w:cs="Segoe UI Emoji"/>
+          <w:b/>
+          <w:bCs/>
+        </w:rPr>
+        <w:br/>
+        <w:t>• Step 11.1.3.3 — Add usage counters (“X plans generated”)</w:t>
+      </w:r>
+      <w:r>
+        <w:rPr>
+          <w:rFonts w:ascii="Segoe UI Emoji" w:hAnsi="Segoe UI Emoji" w:cs="Segoe UI Emoji"/>
+          <w:b/>
+          <w:bCs/>
+        </w:rPr>
+        <w:br/>
+        <w:t>• Step 11.1.3.4 — Add credibility indicators (data-driven claims)</w:t>
+      </w:r>
+    </w:p>
+    <w:p>
+      <w:pPr>
+        <w:spacing w:after="0"/>
+        <w:rPr>
+          <w:rFonts w:ascii="Segoe UI Emoji" w:hAnsi="Segoe UI Emoji" w:cs="Segoe UI Emoji"/>
+          <w:b/>
+          <w:bCs/>
+        </w:rPr>
+      </w:pPr>
+      <w:r>
+        <w:rPr>
+          <w:rFonts w:ascii="Segoe UI Emoji" w:hAnsi="Segoe UI Emoji" w:cs="Segoe UI Emoji"/>
+          <w:b/>
+          <w:bCs/>
+        </w:rPr>
+        <w:t>Task 11.1.4 — Content &amp; Distribution Engine (Critical)</w:t>
+      </w:r>
+      <w:r>
+        <w:rPr>
+          <w:rFonts w:ascii="Segoe UI Emoji" w:hAnsi="Segoe UI Emoji" w:cs="Segoe UI Emoji"/>
+          <w:b/>
+          <w:bCs/>
+        </w:rPr>
+        <w:br/>
+        <w:t>• Step 11.1.4.1 — Produce 2 TikTok videos/day (UGC style)</w:t>
+      </w:r>
+      <w:r>
+        <w:rPr>
+          <w:rFonts w:ascii="Segoe UI Emoji" w:hAnsi="Segoe UI Emoji" w:cs="Segoe UI Emoji"/>
+          <w:b/>
+          <w:bCs/>
+        </w:rPr>
+        <w:br/>
+        <w:t>• Step 11.1.4.2 — Post 1 Reddit thread/day (value-first)</w:t>
+      </w:r>
+      <w:r>
+        <w:rPr>
+          <w:rFonts w:ascii="Segoe UI Emoji" w:hAnsi="Segoe UI Emoji" w:cs="Segoe UI Emoji"/>
+          <w:b/>
+          <w:bCs/>
+        </w:rPr>
+        <w:br/>
+      </w:r>
+      <w:r>
+        <w:rPr>
+          <w:rFonts w:ascii="Segoe UI Emoji" w:hAnsi="Segoe UI Emoji" w:cs="Segoe UI Emoji"/>
+          <w:b/>
+          <w:bCs/>
+        </w:rPr>
+        <w:lastRenderedPageBreak/>
+        <w:t>• Step 11.1.4.3 — Post 1 Twitter/X thread/day (build-in-public)</w:t>
+      </w:r>
+      <w:r>
+        <w:rPr>
+          <w:rFonts w:ascii="Segoe UI Emoji" w:hAnsi="Segoe UI Emoji" w:cs="Segoe UI Emoji"/>
+          <w:b/>
+          <w:bCs/>
+        </w:rPr>
+        <w:br/>
+        <w:t>• Step 11.1.4.4 — Define 5 reusable content templates</w:t>
+      </w:r>
+      <w:r>
+        <w:rPr>
+          <w:rFonts w:ascii="Segoe UI Emoji" w:hAnsi="Segoe UI Emoji" w:cs="Segoe UI Emoji"/>
+          <w:b/>
+          <w:bCs/>
+        </w:rPr>
+        <w:br/>
+        <w:t>• Step 11.1.4.5 — Embed CTA → landing page</w:t>
+      </w:r>
+    </w:p>
+    <w:p>
+      <w:pPr>
+        <w:spacing w:after="0"/>
+        <w:rPr>
+          <w:rFonts w:ascii="Segoe UI Emoji" w:hAnsi="Segoe UI Emoji" w:cs="Segoe UI Emoji"/>
+          <w:b/>
+          <w:bCs/>
+        </w:rPr>
+      </w:pPr>
+      <w:r>
+        <w:rPr>
+          <w:rFonts w:ascii="Segoe UI Emoji" w:hAnsi="Segoe UI Emoji" w:cs="Segoe UI Emoji"/>
+          <w:b/>
+          <w:bCs/>
+        </w:rPr>
+        <w:pict w14:anchorId="0031479F">
+          <v:rect id="_x0000_i1359" style="width:0;height:1.5pt" o:hralign="center" o:hrstd="t" o:hr="t" fillcolor="#a0a0a0" stroked="f"/>
         </w:pict>
       </w:r>
     </w:p>
@@ -5640,43 +5837,25 @@
           <w:b/>
           <w:bCs/>
         </w:rPr>
-        <w:t>🔹 Feature 10.2 — Analytics &amp; Tracking</w:t>
-      </w:r>
-    </w:p>
-    <w:p>
-      <w:pPr>
-        <w:spacing w:after="0"/>
-        <w:rPr>
-          <w:rFonts w:ascii="Segoe UI Emoji" w:hAnsi="Segoe UI Emoji" w:cs="Segoe UI Emoji"/>
-          <w:b/>
-          <w:bCs/>
-        </w:rPr>
-      </w:pPr>
-      <w:r>
-        <w:rPr>
-          <w:rFonts w:ascii="Segoe UI Emoji" w:hAnsi="Segoe UI Emoji" w:cs="Segoe UI Emoji"/>
-          <w:b/>
-          <w:bCs/>
-        </w:rPr>
-        <w:t>Task 10.2.1 — Product Analytics</w:t>
-      </w:r>
-    </w:p>
-    <w:p>
-      <w:pPr>
-        <w:spacing w:after="0"/>
-        <w:rPr>
-          <w:rFonts w:ascii="Segoe UI Emoji" w:hAnsi="Segoe UI Emoji" w:cs="Segoe UI Emoji"/>
-          <w:b/>
-          <w:bCs/>
-        </w:rPr>
-      </w:pPr>
-      <w:r>
-        <w:rPr>
-          <w:rFonts w:ascii="Segoe UI Emoji" w:hAnsi="Segoe UI Emoji" w:cs="Segoe UI Emoji"/>
-          <w:b/>
-          <w:bCs/>
-        </w:rPr>
-        <w:t>• Step 10.2.1.1 — Track user events</w:t>
+        <w:t>🔹 Feature 11.2 — Analytics &amp; Tracking</w:t>
+      </w:r>
+    </w:p>
+    <w:p>
+      <w:pPr>
+        <w:spacing w:after="0"/>
+        <w:rPr>
+          <w:rFonts w:ascii="Segoe UI Emoji" w:hAnsi="Segoe UI Emoji" w:cs="Segoe UI Emoji"/>
+          <w:b/>
+          <w:bCs/>
+        </w:rPr>
+      </w:pPr>
+      <w:r>
+        <w:rPr>
+          <w:rFonts w:ascii="Segoe UI Emoji" w:hAnsi="Segoe UI Emoji" w:cs="Segoe UI Emoji"/>
+          <w:b/>
+          <w:bCs/>
+        </w:rPr>
+        <w:t>Task 11.2.1 — Product Analytics Instrumentation</w:t>
       </w:r>
       <w:r>
         <w:rPr>
@@ -5685,7 +5864,43 @@
           <w:bCs/>
         </w:rPr>
         <w:br/>
-        <w:t>• Step 10.2.1.2 — Funnel analysis</w:t>
+        <w:t xml:space="preserve">• Step 11.2.1.1 — Integrate </w:t>
+      </w:r>
+      <w:proofErr w:type="spellStart"/>
+      <w:r>
+        <w:rPr>
+          <w:rFonts w:ascii="Segoe UI Emoji" w:hAnsi="Segoe UI Emoji" w:cs="Segoe UI Emoji"/>
+          <w:b/>
+          <w:bCs/>
+        </w:rPr>
+        <w:t>PostHog</w:t>
+      </w:r>
+      <w:proofErr w:type="spellEnd"/>
+      <w:r>
+        <w:rPr>
+          <w:rFonts w:ascii="Segoe UI Emoji" w:hAnsi="Segoe UI Emoji" w:cs="Segoe UI Emoji"/>
+          <w:b/>
+          <w:bCs/>
+        </w:rPr>
+        <w:t xml:space="preserve"> (or </w:t>
+      </w:r>
+      <w:proofErr w:type="spellStart"/>
+      <w:r>
+        <w:rPr>
+          <w:rFonts w:ascii="Segoe UI Emoji" w:hAnsi="Segoe UI Emoji" w:cs="Segoe UI Emoji"/>
+          <w:b/>
+          <w:bCs/>
+        </w:rPr>
+        <w:t>Mixpanel</w:t>
+      </w:r>
+      <w:proofErr w:type="spellEnd"/>
+      <w:r>
+        <w:rPr>
+          <w:rFonts w:ascii="Segoe UI Emoji" w:hAnsi="Segoe UI Emoji" w:cs="Segoe UI Emoji"/>
+          <w:b/>
+          <w:bCs/>
+        </w:rPr>
+        <w:t>)</w:t>
       </w:r>
       <w:r>
         <w:rPr>
@@ -5694,26 +5909,261 @@
           <w:bCs/>
         </w:rPr>
         <w:br/>
-        <w:t>• Step 10.2.1.3 — Retention metrics</w:t>
-      </w:r>
-    </w:p>
-    <w:p>
-      <w:pPr>
-        <w:spacing w:after="0"/>
-        <w:rPr>
-          <w:rFonts w:ascii="Segoe UI Emoji" w:hAnsi="Segoe UI Emoji" w:cs="Segoe UI Emoji"/>
-          <w:b/>
-          <w:bCs/>
-        </w:rPr>
-      </w:pPr>
-      <w:r>
-        <w:rPr>
-          <w:rFonts w:ascii="Segoe UI Emoji" w:hAnsi="Segoe UI Emoji" w:cs="Segoe UI Emoji"/>
-          <w:b/>
-          <w:bCs/>
-        </w:rPr>
-        <w:pict w14:anchorId="715505B3">
-          <v:rect id="_x0000_i1430" style="width:0;height:1.5pt" o:hralign="center" o:hrstd="t" o:hr="t" fillcolor="#a0a0a0" stroked="f"/>
+        <w:t>• Step 11.2.1.2 — Define event schema (onboarding, plan, paywall)</w:t>
+      </w:r>
+      <w:r>
+        <w:rPr>
+          <w:rFonts w:ascii="Segoe UI Emoji" w:hAnsi="Segoe UI Emoji" w:cs="Segoe UI Emoji"/>
+          <w:b/>
+          <w:bCs/>
+        </w:rPr>
+        <w:br/>
+        <w:t xml:space="preserve">• Step 11.2.1.3 — Track key events: </w:t>
+      </w:r>
+      <w:proofErr w:type="spellStart"/>
+      <w:r>
+        <w:rPr>
+          <w:rFonts w:ascii="Segoe UI Emoji" w:hAnsi="Segoe UI Emoji" w:cs="Segoe UI Emoji"/>
+          <w:b/>
+          <w:bCs/>
+        </w:rPr>
+        <w:t>onboarding_started</w:t>
+      </w:r>
+      <w:proofErr w:type="spellEnd"/>
+      <w:r>
+        <w:rPr>
+          <w:rFonts w:ascii="Segoe UI Emoji" w:hAnsi="Segoe UI Emoji" w:cs="Segoe UI Emoji"/>
+          <w:b/>
+          <w:bCs/>
+        </w:rPr>
+        <w:t xml:space="preserve">, </w:t>
+      </w:r>
+      <w:proofErr w:type="spellStart"/>
+      <w:r>
+        <w:rPr>
+          <w:rFonts w:ascii="Segoe UI Emoji" w:hAnsi="Segoe UI Emoji" w:cs="Segoe UI Emoji"/>
+          <w:b/>
+          <w:bCs/>
+        </w:rPr>
+        <w:t>onboarding_completed</w:t>
+      </w:r>
+      <w:proofErr w:type="spellEnd"/>
+      <w:r>
+        <w:rPr>
+          <w:rFonts w:ascii="Segoe UI Emoji" w:hAnsi="Segoe UI Emoji" w:cs="Segoe UI Emoji"/>
+          <w:b/>
+          <w:bCs/>
+        </w:rPr>
+        <w:t xml:space="preserve">, </w:t>
+      </w:r>
+      <w:proofErr w:type="spellStart"/>
+      <w:r>
+        <w:rPr>
+          <w:rFonts w:ascii="Segoe UI Emoji" w:hAnsi="Segoe UI Emoji" w:cs="Segoe UI Emoji"/>
+          <w:b/>
+          <w:bCs/>
+        </w:rPr>
+        <w:t>plan_generated</w:t>
+      </w:r>
+      <w:proofErr w:type="spellEnd"/>
+      <w:r>
+        <w:rPr>
+          <w:rFonts w:ascii="Segoe UI Emoji" w:hAnsi="Segoe UI Emoji" w:cs="Segoe UI Emoji"/>
+          <w:b/>
+          <w:bCs/>
+        </w:rPr>
+        <w:t xml:space="preserve">, </w:t>
+      </w:r>
+      <w:proofErr w:type="spellStart"/>
+      <w:r>
+        <w:rPr>
+          <w:rFonts w:ascii="Segoe UI Emoji" w:hAnsi="Segoe UI Emoji" w:cs="Segoe UI Emoji"/>
+          <w:b/>
+          <w:bCs/>
+        </w:rPr>
+        <w:t>paywall_viewed</w:t>
+      </w:r>
+      <w:proofErr w:type="spellEnd"/>
+      <w:r>
+        <w:rPr>
+          <w:rFonts w:ascii="Segoe UI Emoji" w:hAnsi="Segoe UI Emoji" w:cs="Segoe UI Emoji"/>
+          <w:b/>
+          <w:bCs/>
+        </w:rPr>
+        <w:t xml:space="preserve">, </w:t>
+      </w:r>
+      <w:proofErr w:type="spellStart"/>
+      <w:r>
+        <w:rPr>
+          <w:rFonts w:ascii="Segoe UI Emoji" w:hAnsi="Segoe UI Emoji" w:cs="Segoe UI Emoji"/>
+          <w:b/>
+          <w:bCs/>
+        </w:rPr>
+        <w:t>subscription_started</w:t>
+      </w:r>
+      <w:proofErr w:type="spellEnd"/>
+    </w:p>
+    <w:p>
+      <w:pPr>
+        <w:spacing w:after="0"/>
+        <w:rPr>
+          <w:rFonts w:ascii="Segoe UI Emoji" w:hAnsi="Segoe UI Emoji" w:cs="Segoe UI Emoji"/>
+          <w:b/>
+          <w:bCs/>
+        </w:rPr>
+      </w:pPr>
+      <w:r>
+        <w:rPr>
+          <w:rFonts w:ascii="Segoe UI Emoji" w:hAnsi="Segoe UI Emoji" w:cs="Segoe UI Emoji"/>
+          <w:b/>
+          <w:bCs/>
+        </w:rPr>
+        <w:t>Task 11.2.2 — Funnel Analysis</w:t>
+      </w:r>
+      <w:r>
+        <w:rPr>
+          <w:rFonts w:ascii="Segoe UI Emoji" w:hAnsi="Segoe UI Emoji" w:cs="Segoe UI Emoji"/>
+          <w:b/>
+          <w:bCs/>
+        </w:rPr>
+        <w:br/>
+        <w:t>• Step 11.2.2.1 — Build funnel: Visit → Plan → Paywall → Paid</w:t>
+      </w:r>
+      <w:r>
+        <w:rPr>
+          <w:rFonts w:ascii="Segoe UI Emoji" w:hAnsi="Segoe UI Emoji" w:cs="Segoe UI Emoji"/>
+          <w:b/>
+          <w:bCs/>
+        </w:rPr>
+        <w:br/>
+        <w:t>• Step 11.2.2.2 — Identify drop-off points</w:t>
+      </w:r>
+      <w:r>
+        <w:rPr>
+          <w:rFonts w:ascii="Segoe UI Emoji" w:hAnsi="Segoe UI Emoji" w:cs="Segoe UI Emoji"/>
+          <w:b/>
+          <w:bCs/>
+        </w:rPr>
+        <w:br/>
+        <w:t>• Step 11.2.2.3 — Optimize weakest step weekly</w:t>
+      </w:r>
+    </w:p>
+    <w:p>
+      <w:pPr>
+        <w:spacing w:after="0"/>
+        <w:rPr>
+          <w:rFonts w:ascii="Segoe UI Emoji" w:hAnsi="Segoe UI Emoji" w:cs="Segoe UI Emoji"/>
+          <w:b/>
+          <w:bCs/>
+        </w:rPr>
+      </w:pPr>
+      <w:r>
+        <w:rPr>
+          <w:rFonts w:ascii="Segoe UI Emoji" w:hAnsi="Segoe UI Emoji" w:cs="Segoe UI Emoji"/>
+          <w:b/>
+          <w:bCs/>
+        </w:rPr>
+        <w:t>Task 11.2.3 — Retention Metrics</w:t>
+      </w:r>
+      <w:r>
+        <w:rPr>
+          <w:rFonts w:ascii="Segoe UI Emoji" w:hAnsi="Segoe UI Emoji" w:cs="Segoe UI Emoji"/>
+          <w:b/>
+          <w:bCs/>
+        </w:rPr>
+        <w:br/>
+        <w:t>• Step 11.2.3.1 — Track D1, D7, D30 retention</w:t>
+      </w:r>
+      <w:r>
+        <w:rPr>
+          <w:rFonts w:ascii="Segoe UI Emoji" w:hAnsi="Segoe UI Emoji" w:cs="Segoe UI Emoji"/>
+          <w:b/>
+          <w:bCs/>
+        </w:rPr>
+        <w:br/>
+        <w:t>• Step 11.2.3.2 — Track sessions per user</w:t>
+      </w:r>
+      <w:r>
+        <w:rPr>
+          <w:rFonts w:ascii="Segoe UI Emoji" w:hAnsi="Segoe UI Emoji" w:cs="Segoe UI Emoji"/>
+          <w:b/>
+          <w:bCs/>
+        </w:rPr>
+        <w:br/>
+        <w:t>• Step 11.2.3.3 — Track feature usage (AI calls, logs)</w:t>
+      </w:r>
+    </w:p>
+    <w:p>
+      <w:pPr>
+        <w:spacing w:after="0"/>
+        <w:rPr>
+          <w:rFonts w:ascii="Segoe UI Emoji" w:hAnsi="Segoe UI Emoji" w:cs="Segoe UI Emoji"/>
+          <w:b/>
+          <w:bCs/>
+        </w:rPr>
+      </w:pPr>
+      <w:r>
+        <w:rPr>
+          <w:rFonts w:ascii="Segoe UI Emoji" w:hAnsi="Segoe UI Emoji" w:cs="Segoe UI Emoji"/>
+          <w:b/>
+          <w:bCs/>
+        </w:rPr>
+        <w:t>Task 11.2.4 — Experimentation Framework</w:t>
+      </w:r>
+      <w:r>
+        <w:rPr>
+          <w:rFonts w:ascii="Segoe UI Emoji" w:hAnsi="Segoe UI Emoji" w:cs="Segoe UI Emoji"/>
+          <w:b/>
+          <w:bCs/>
+        </w:rPr>
+        <w:br/>
+        <w:t>• Step 11.2.4.1 — Enable A/B testing infra</w:t>
+      </w:r>
+      <w:r>
+        <w:rPr>
+          <w:rFonts w:ascii="Segoe UI Emoji" w:hAnsi="Segoe UI Emoji" w:cs="Segoe UI Emoji"/>
+          <w:b/>
+          <w:bCs/>
+        </w:rPr>
+        <w:br/>
+        <w:t>• Step 11.2.4.2 — Test paywall timing (before vs after plan)</w:t>
+      </w:r>
+      <w:r>
+        <w:rPr>
+          <w:rFonts w:ascii="Segoe UI Emoji" w:hAnsi="Segoe UI Emoji" w:cs="Segoe UI Emoji"/>
+          <w:b/>
+          <w:bCs/>
+        </w:rPr>
+        <w:br/>
+        <w:t>• Step 11.2.4.3 — Test pricing ($9 vs $12 vs $19)</w:t>
+      </w:r>
+      <w:r>
+        <w:rPr>
+          <w:rFonts w:ascii="Segoe UI Emoji" w:hAnsi="Segoe UI Emoji" w:cs="Segoe UI Emoji"/>
+          <w:b/>
+          <w:bCs/>
+        </w:rPr>
+        <w:br/>
+        <w:t>• Step 11.2.4.4 — Test copy variants</w:t>
+      </w:r>
+    </w:p>
+    <w:p>
+      <w:pPr>
+        <w:spacing w:after="0"/>
+        <w:rPr>
+          <w:rFonts w:ascii="Segoe UI Emoji" w:hAnsi="Segoe UI Emoji" w:cs="Segoe UI Emoji"/>
+          <w:b/>
+          <w:bCs/>
+        </w:rPr>
+      </w:pPr>
+      <w:r>
+        <w:rPr>
+          <w:rFonts w:ascii="Segoe UI Emoji" w:hAnsi="Segoe UI Emoji" w:cs="Segoe UI Emoji"/>
+          <w:b/>
+          <w:bCs/>
+        </w:rPr>
+        <w:pict w14:anchorId="7D9542E0">
+          <v:rect id="_x0000_i1360" style="width:0;height:1.5pt" o:hralign="center" o:hrstd="t" o:hr="t" fillcolor="#a0a0a0" stroked="f"/>
         </w:pict>
       </w:r>
     </w:p>
@@ -5732,43 +6182,25 @@
           <w:b/>
           <w:bCs/>
         </w:rPr>
-        <w:t>🔹 Feature 10.3 — Referral System</w:t>
-      </w:r>
-    </w:p>
-    <w:p>
-      <w:pPr>
-        <w:spacing w:after="0"/>
-        <w:rPr>
-          <w:rFonts w:ascii="Segoe UI Emoji" w:hAnsi="Segoe UI Emoji" w:cs="Segoe UI Emoji"/>
-          <w:b/>
-          <w:bCs/>
-        </w:rPr>
-      </w:pPr>
-      <w:r>
-        <w:rPr>
-          <w:rFonts w:ascii="Segoe UI Emoji" w:hAnsi="Segoe UI Emoji" w:cs="Segoe UI Emoji"/>
-          <w:b/>
-          <w:bCs/>
-        </w:rPr>
-        <w:t>Task 10.3.1 — Viral Growth</w:t>
-      </w:r>
-    </w:p>
-    <w:p>
-      <w:pPr>
-        <w:spacing w:after="0"/>
-        <w:rPr>
-          <w:rFonts w:ascii="Segoe UI Emoji" w:hAnsi="Segoe UI Emoji" w:cs="Segoe UI Emoji"/>
-          <w:b/>
-          <w:bCs/>
-        </w:rPr>
-      </w:pPr>
-      <w:r>
-        <w:rPr>
-          <w:rFonts w:ascii="Segoe UI Emoji" w:hAnsi="Segoe UI Emoji" w:cs="Segoe UI Emoji"/>
-          <w:b/>
-          <w:bCs/>
-        </w:rPr>
-        <w:t>• Step 10.3.1.1 — Invite system</w:t>
+        <w:t>🔹 Feature 11.3 — Referral System</w:t>
+      </w:r>
+    </w:p>
+    <w:p>
+      <w:pPr>
+        <w:spacing w:after="0"/>
+        <w:rPr>
+          <w:rFonts w:ascii="Segoe UI Emoji" w:hAnsi="Segoe UI Emoji" w:cs="Segoe UI Emoji"/>
+          <w:b/>
+          <w:bCs/>
+        </w:rPr>
+      </w:pPr>
+      <w:r>
+        <w:rPr>
+          <w:rFonts w:ascii="Segoe UI Emoji" w:hAnsi="Segoe UI Emoji" w:cs="Segoe UI Emoji"/>
+          <w:b/>
+          <w:bCs/>
+        </w:rPr>
+        <w:t>Task 11.3.1 — Viral Growth Loop</w:t>
       </w:r>
       <w:r>
         <w:rPr>
@@ -5777,7 +6209,7 @@
           <w:bCs/>
         </w:rPr>
         <w:br/>
-        <w:t>• Step 10.3.1.2 — Referral rewards</w:t>
+        <w:t>• Step 11.3.1.1 — Build referral system</w:t>
       </w:r>
       <w:r>
         <w:rPr>
@@ -5786,26 +6218,133 @@
           <w:bCs/>
         </w:rPr>
         <w:br/>
-        <w:t>• Step 10.3.1.3 — Track referrals</w:t>
-      </w:r>
-    </w:p>
-    <w:p>
-      <w:pPr>
-        <w:spacing w:after="0"/>
-        <w:rPr>
-          <w:rFonts w:ascii="Segoe UI Emoji" w:hAnsi="Segoe UI Emoji" w:cs="Segoe UI Emoji"/>
-          <w:b/>
-          <w:bCs/>
-        </w:rPr>
-      </w:pPr>
-      <w:r>
-        <w:rPr>
-          <w:rFonts w:ascii="Segoe UI Emoji" w:hAnsi="Segoe UI Emoji" w:cs="Segoe UI Emoji"/>
-          <w:b/>
-          <w:bCs/>
-        </w:rPr>
-        <w:pict w14:anchorId="65C88668">
-          <v:rect id="_x0000_i1431" style="width:0;height:1.5pt" o:hralign="center" o:hrstd="t" o:hr="t" fillcolor="#a0a0a0" stroked="f"/>
+        <w:t>• Step 11.3.1.2 — Add referral rewards (credits / premium days)</w:t>
+      </w:r>
+      <w:r>
+        <w:rPr>
+          <w:rFonts w:ascii="Segoe UI Emoji" w:hAnsi="Segoe UI Emoji" w:cs="Segoe UI Emoji"/>
+          <w:b/>
+          <w:bCs/>
+        </w:rPr>
+        <w:br/>
+        <w:t>• Step 11.3.1.3 — Add shareable plan links</w:t>
+      </w:r>
+    </w:p>
+    <w:p>
+      <w:pPr>
+        <w:spacing w:after="0"/>
+        <w:rPr>
+          <w:rFonts w:ascii="Segoe UI Emoji" w:hAnsi="Segoe UI Emoji" w:cs="Segoe UI Emoji"/>
+          <w:b/>
+          <w:bCs/>
+        </w:rPr>
+      </w:pPr>
+      <w:r>
+        <w:rPr>
+          <w:rFonts w:ascii="Segoe UI Emoji" w:hAnsi="Segoe UI Emoji" w:cs="Segoe UI Emoji"/>
+          <w:b/>
+          <w:bCs/>
+        </w:rPr>
+        <w:t>Task 11.3.2 — Social Sharing Mechanics</w:t>
+      </w:r>
+      <w:r>
+        <w:rPr>
+          <w:rFonts w:ascii="Segoe UI Emoji" w:hAnsi="Segoe UI Emoji" w:cs="Segoe UI Emoji"/>
+          <w:b/>
+          <w:bCs/>
+        </w:rPr>
+        <w:br/>
+        <w:t>• Step 11.3.2.1 — Add “Share your plan” CTA</w:t>
+      </w:r>
+      <w:r>
+        <w:rPr>
+          <w:rFonts w:ascii="Segoe UI Emoji" w:hAnsi="Segoe UI Emoji" w:cs="Segoe UI Emoji"/>
+          <w:b/>
+          <w:bCs/>
+        </w:rPr>
+        <w:br/>
+        <w:t>• Step 11.3.2.2 — Generate shareable images</w:t>
+      </w:r>
+      <w:r>
+        <w:rPr>
+          <w:rFonts w:ascii="Segoe UI Emoji" w:hAnsi="Segoe UI Emoji" w:cs="Segoe UI Emoji"/>
+          <w:b/>
+          <w:bCs/>
+        </w:rPr>
+        <w:br/>
+        <w:t>• Step 11.3.2.3 — Add comparison features (leaderboards)</w:t>
+      </w:r>
+    </w:p>
+    <w:p>
+      <w:pPr>
+        <w:spacing w:after="0"/>
+        <w:rPr>
+          <w:rFonts w:ascii="Segoe UI Emoji" w:hAnsi="Segoe UI Emoji" w:cs="Segoe UI Emoji"/>
+          <w:b/>
+          <w:bCs/>
+        </w:rPr>
+      </w:pPr>
+      <w:r>
+        <w:rPr>
+          <w:rFonts w:ascii="Segoe UI Emoji" w:hAnsi="Segoe UI Emoji" w:cs="Segoe UI Emoji"/>
+          <w:b/>
+          <w:bCs/>
+        </w:rPr>
+        <w:t>Task 11.3.3 — Referral Tracking</w:t>
+      </w:r>
+      <w:r>
+        <w:rPr>
+          <w:rFonts w:ascii="Segoe UI Emoji" w:hAnsi="Segoe UI Emoji" w:cs="Segoe UI Emoji"/>
+          <w:b/>
+          <w:bCs/>
+        </w:rPr>
+        <w:br/>
+        <w:t>• Step 11.3.3.1 — Track referral attribution</w:t>
+      </w:r>
+      <w:r>
+        <w:rPr>
+          <w:rFonts w:ascii="Segoe UI Emoji" w:hAnsi="Segoe UI Emoji" w:cs="Segoe UI Emoji"/>
+          <w:b/>
+          <w:bCs/>
+        </w:rPr>
+        <w:br/>
+      </w:r>
+      <w:r>
+        <w:rPr>
+          <w:rFonts w:ascii="Segoe UI Emoji" w:hAnsi="Segoe UI Emoji" w:cs="Segoe UI Emoji"/>
+          <w:b/>
+          <w:bCs/>
+        </w:rPr>
+        <w:lastRenderedPageBreak/>
+        <w:t>• Step 11.3.3.2 — Track conversion per referral</w:t>
+      </w:r>
+      <w:r>
+        <w:rPr>
+          <w:rFonts w:ascii="Segoe UI Emoji" w:hAnsi="Segoe UI Emoji" w:cs="Segoe UI Emoji"/>
+          <w:b/>
+          <w:bCs/>
+        </w:rPr>
+        <w:br/>
+        <w:t>• Step 11.3.3.3 — Optimize reward thresholds</w:t>
+      </w:r>
+    </w:p>
+    <w:p>
+      <w:pPr>
+        <w:spacing w:after="0"/>
+        <w:rPr>
+          <w:rFonts w:ascii="Segoe UI Emoji" w:hAnsi="Segoe UI Emoji" w:cs="Segoe UI Emoji"/>
+          <w:b/>
+          <w:bCs/>
+        </w:rPr>
+      </w:pPr>
+      <w:r>
+        <w:rPr>
+          <w:rFonts w:ascii="Segoe UI Emoji" w:hAnsi="Segoe UI Emoji" w:cs="Segoe UI Emoji"/>
+          <w:b/>
+          <w:bCs/>
+        </w:rPr>
+        <w:pict w14:anchorId="62337A58">
+          <v:rect id="_x0000_i1361" style="width:0;height:1.5pt" o:hralign="center" o:hrstd="t" o:hr="t" fillcolor="#a0a0a0" stroked="f"/>
         </w:pict>
       </w:r>
     </w:p>
@@ -5824,26 +6363,26 @@
           <w:b/>
           <w:bCs/>
         </w:rPr>
-        <w:t>💰 PHASE 11 — MONETIZATION</w:t>
-      </w:r>
-    </w:p>
-    <w:p>
-      <w:pPr>
-        <w:spacing w:after="0"/>
-        <w:rPr>
-          <w:rFonts w:ascii="Segoe UI Emoji" w:hAnsi="Segoe UI Emoji" w:cs="Segoe UI Emoji"/>
-          <w:b/>
-          <w:bCs/>
-        </w:rPr>
-      </w:pPr>
-      <w:r>
-        <w:rPr>
-          <w:rFonts w:ascii="Segoe UI Emoji" w:hAnsi="Segoe UI Emoji" w:cs="Segoe UI Emoji"/>
-          <w:b/>
-          <w:bCs/>
-        </w:rPr>
-        <w:pict w14:anchorId="58D930A7">
-          <v:rect id="_x0000_i1432" style="width:0;height:1.5pt" o:hralign="center" o:hrstd="t" o:hr="t" fillcolor="#a0a0a0" stroked="f"/>
+        <w:t>💰 PHASE 12 — MONETIZATION (Revenue Engine)</w:t>
+      </w:r>
+    </w:p>
+    <w:p>
+      <w:pPr>
+        <w:spacing w:after="0"/>
+        <w:rPr>
+          <w:rFonts w:ascii="Segoe UI Emoji" w:hAnsi="Segoe UI Emoji" w:cs="Segoe UI Emoji"/>
+          <w:b/>
+          <w:bCs/>
+        </w:rPr>
+      </w:pPr>
+      <w:r>
+        <w:rPr>
+          <w:rFonts w:ascii="Segoe UI Emoji" w:hAnsi="Segoe UI Emoji" w:cs="Segoe UI Emoji"/>
+          <w:b/>
+          <w:bCs/>
+        </w:rPr>
+        <w:pict w14:anchorId="6BE96AA4">
+          <v:rect id="_x0000_i1362" style="width:0;height:1.5pt" o:hralign="center" o:hrstd="t" o:hr="t" fillcolor="#a0a0a0" stroked="f"/>
         </w:pict>
       </w:r>
     </w:p>
@@ -5862,7 +6401,353 @@
           <w:b/>
           <w:bCs/>
         </w:rPr>
-        <w:t>🔹 Feature 11.1 — Subscription Infrastructure</w:t>
+        <w:t>🔹 Feature 12.1 — Subscription Infrastructure</w:t>
+      </w:r>
+    </w:p>
+    <w:p>
+      <w:pPr>
+        <w:spacing w:after="0"/>
+        <w:rPr>
+          <w:rFonts w:ascii="Segoe UI Emoji" w:hAnsi="Segoe UI Emoji" w:cs="Segoe UI Emoji"/>
+          <w:b/>
+          <w:bCs/>
+        </w:rPr>
+      </w:pPr>
+      <w:r>
+        <w:rPr>
+          <w:rFonts w:ascii="Segoe UI Emoji" w:hAnsi="Segoe UI Emoji" w:cs="Segoe UI Emoji"/>
+          <w:b/>
+          <w:bCs/>
+        </w:rPr>
+        <w:t>Task 12.1.1 — Billing Integration</w:t>
+      </w:r>
+      <w:r>
+        <w:rPr>
+          <w:rFonts w:ascii="Segoe UI Emoji" w:hAnsi="Segoe UI Emoji" w:cs="Segoe UI Emoji"/>
+          <w:b/>
+          <w:bCs/>
+        </w:rPr>
+        <w:br/>
+        <w:t>• Step 12.1.1.1 — Integrate Stripe (subscriptions + webhooks)</w:t>
+      </w:r>
+      <w:r>
+        <w:rPr>
+          <w:rFonts w:ascii="Segoe UI Emoji" w:hAnsi="Segoe UI Emoji" w:cs="Segoe UI Emoji"/>
+          <w:b/>
+          <w:bCs/>
+        </w:rPr>
+        <w:br/>
+        <w:t>• Step 12.1.1.2 — Define pricing tiers (Free, Pro, Pro+)</w:t>
+      </w:r>
+      <w:r>
+        <w:rPr>
+          <w:rFonts w:ascii="Segoe UI Emoji" w:hAnsi="Segoe UI Emoji" w:cs="Segoe UI Emoji"/>
+          <w:b/>
+          <w:bCs/>
+        </w:rPr>
+        <w:br/>
+        <w:t>• Step 12.1.1.3 — Add annual plan ($99/year)</w:t>
+      </w:r>
+    </w:p>
+    <w:p>
+      <w:pPr>
+        <w:spacing w:after="0"/>
+        <w:rPr>
+          <w:rFonts w:ascii="Segoe UI Emoji" w:hAnsi="Segoe UI Emoji" w:cs="Segoe UI Emoji"/>
+          <w:b/>
+          <w:bCs/>
+        </w:rPr>
+      </w:pPr>
+      <w:r>
+        <w:rPr>
+          <w:rFonts w:ascii="Segoe UI Emoji" w:hAnsi="Segoe UI Emoji" w:cs="Segoe UI Emoji"/>
+          <w:b/>
+          <w:bCs/>
+        </w:rPr>
+        <w:t>Task 12.1.2 — Subscription Lifecycle</w:t>
+      </w:r>
+      <w:r>
+        <w:rPr>
+          <w:rFonts w:ascii="Segoe UI Emoji" w:hAnsi="Segoe UI Emoji" w:cs="Segoe UI Emoji"/>
+          <w:b/>
+          <w:bCs/>
+        </w:rPr>
+        <w:br/>
+        <w:t>• Step 12.1.2.1 — Handle subscription creation</w:t>
+      </w:r>
+      <w:r>
+        <w:rPr>
+          <w:rFonts w:ascii="Segoe UI Emoji" w:hAnsi="Segoe UI Emoji" w:cs="Segoe UI Emoji"/>
+          <w:b/>
+          <w:bCs/>
+        </w:rPr>
+        <w:br/>
+        <w:t>• Step 12.1.2.2 — Handle cancellations &amp; renewals</w:t>
+      </w:r>
+      <w:r>
+        <w:rPr>
+          <w:rFonts w:ascii="Segoe UI Emoji" w:hAnsi="Segoe UI Emoji" w:cs="Segoe UI Emoji"/>
+          <w:b/>
+          <w:bCs/>
+        </w:rPr>
+        <w:br/>
+        <w:t>• Step 12.1.2.3 — Handle failed payments (retry logic)</w:t>
+      </w:r>
+    </w:p>
+    <w:p>
+      <w:pPr>
+        <w:spacing w:after="0"/>
+        <w:rPr>
+          <w:rFonts w:ascii="Segoe UI Emoji" w:hAnsi="Segoe UI Emoji" w:cs="Segoe UI Emoji"/>
+          <w:b/>
+          <w:bCs/>
+        </w:rPr>
+      </w:pPr>
+      <w:r>
+        <w:rPr>
+          <w:rFonts w:ascii="Segoe UI Emoji" w:hAnsi="Segoe UI Emoji" w:cs="Segoe UI Emoji"/>
+          <w:b/>
+          <w:bCs/>
+        </w:rPr>
+        <w:pict w14:anchorId="74AD0C43">
+          <v:rect id="_x0000_i1363" style="width:0;height:1.5pt" o:hralign="center" o:hrstd="t" o:hr="t" fillcolor="#a0a0a0" stroked="f"/>
+        </w:pict>
+      </w:r>
+    </w:p>
+    <w:p>
+      <w:pPr>
+        <w:spacing w:after="0"/>
+        <w:rPr>
+          <w:rFonts w:ascii="Segoe UI Emoji" w:hAnsi="Segoe UI Emoji" w:cs="Segoe UI Emoji"/>
+          <w:b/>
+          <w:bCs/>
+        </w:rPr>
+      </w:pPr>
+      <w:r>
+        <w:rPr>
+          <w:rFonts w:ascii="Segoe UI Emoji" w:hAnsi="Segoe UI Emoji" w:cs="Segoe UI Emoji"/>
+          <w:b/>
+          <w:bCs/>
+        </w:rPr>
+        <w:t>🔹 Feature 12.2 — Access Control</w:t>
+      </w:r>
+    </w:p>
+    <w:p>
+      <w:pPr>
+        <w:spacing w:after="0"/>
+        <w:rPr>
+          <w:rFonts w:ascii="Segoe UI Emoji" w:hAnsi="Segoe UI Emoji" w:cs="Segoe UI Emoji"/>
+          <w:b/>
+          <w:bCs/>
+        </w:rPr>
+      </w:pPr>
+      <w:r>
+        <w:rPr>
+          <w:rFonts w:ascii="Segoe UI Emoji" w:hAnsi="Segoe UI Emoji" w:cs="Segoe UI Emoji"/>
+          <w:b/>
+          <w:bCs/>
+        </w:rPr>
+        <w:t>Task 12.2.1 — Feature Gating</w:t>
+      </w:r>
+      <w:r>
+        <w:rPr>
+          <w:rFonts w:ascii="Segoe UI Emoji" w:hAnsi="Segoe UI Emoji" w:cs="Segoe UI Emoji"/>
+          <w:b/>
+          <w:bCs/>
+        </w:rPr>
+        <w:br/>
+        <w:t>• Step 12.2.1.1 — Define free vs paid capabilities</w:t>
+      </w:r>
+      <w:r>
+        <w:rPr>
+          <w:rFonts w:ascii="Segoe UI Emoji" w:hAnsi="Segoe UI Emoji" w:cs="Segoe UI Emoji"/>
+          <w:b/>
+          <w:bCs/>
+        </w:rPr>
+        <w:br/>
+        <w:t>• Step 12.2.1.2 — Implement backend access middleware</w:t>
+      </w:r>
+      <w:r>
+        <w:rPr>
+          <w:rFonts w:ascii="Segoe UI Emoji" w:hAnsi="Segoe UI Emoji" w:cs="Segoe UI Emoji"/>
+          <w:b/>
+          <w:bCs/>
+        </w:rPr>
+        <w:br/>
+        <w:t>• Step 12.2.1.3 — Add soft usage limits</w:t>
+      </w:r>
+    </w:p>
+    <w:p>
+      <w:pPr>
+        <w:spacing w:after="0"/>
+        <w:rPr>
+          <w:rFonts w:ascii="Segoe UI Emoji" w:hAnsi="Segoe UI Emoji" w:cs="Segoe UI Emoji"/>
+          <w:b/>
+          <w:bCs/>
+        </w:rPr>
+      </w:pPr>
+      <w:r>
+        <w:rPr>
+          <w:rFonts w:ascii="Segoe UI Emoji" w:hAnsi="Segoe UI Emoji" w:cs="Segoe UI Emoji"/>
+          <w:b/>
+          <w:bCs/>
+        </w:rPr>
+        <w:t>Task 12.2.2 — Paywall Optimization</w:t>
+      </w:r>
+      <w:r>
+        <w:rPr>
+          <w:rFonts w:ascii="Segoe UI Emoji" w:hAnsi="Segoe UI Emoji" w:cs="Segoe UI Emoji"/>
+          <w:b/>
+          <w:bCs/>
+        </w:rPr>
+        <w:br/>
+        <w:t>• Step 12.2.2.1 — Implement partial content locking</w:t>
+      </w:r>
+      <w:r>
+        <w:rPr>
+          <w:rFonts w:ascii="Segoe UI Emoji" w:hAnsi="Segoe UI Emoji" w:cs="Segoe UI Emoji"/>
+          <w:b/>
+          <w:bCs/>
+        </w:rPr>
+        <w:br/>
+        <w:t>• Step 12.2.2.2 — Add contextual upgrade prompts</w:t>
+      </w:r>
+      <w:r>
+        <w:rPr>
+          <w:rFonts w:ascii="Segoe UI Emoji" w:hAnsi="Segoe UI Emoji" w:cs="Segoe UI Emoji"/>
+          <w:b/>
+          <w:bCs/>
+        </w:rPr>
+        <w:br/>
+        <w:t>• Step 12.2.2.3 — Add value-based messaging</w:t>
+      </w:r>
+    </w:p>
+    <w:p>
+      <w:pPr>
+        <w:spacing w:after="0"/>
+        <w:rPr>
+          <w:rFonts w:ascii="Segoe UI Emoji" w:hAnsi="Segoe UI Emoji" w:cs="Segoe UI Emoji"/>
+          <w:b/>
+          <w:bCs/>
+        </w:rPr>
+      </w:pPr>
+      <w:r>
+        <w:rPr>
+          <w:rFonts w:ascii="Segoe UI Emoji" w:hAnsi="Segoe UI Emoji" w:cs="Segoe UI Emoji"/>
+          <w:b/>
+          <w:bCs/>
+        </w:rPr>
+        <w:t>Task 12.2.3 — Outcome-Based Monetization</w:t>
+      </w:r>
+      <w:r>
+        <w:rPr>
+          <w:rFonts w:ascii="Segoe UI Emoji" w:hAnsi="Segoe UI Emoji" w:cs="Segoe UI Emoji"/>
+          <w:b/>
+          <w:bCs/>
+        </w:rPr>
+        <w:br/>
+        <w:t>• Step 12.2.3.1 — Add goal-specific premium plans</w:t>
+      </w:r>
+      <w:r>
+        <w:rPr>
+          <w:rFonts w:ascii="Segoe UI Emoji" w:hAnsi="Segoe UI Emoji" w:cs="Segoe UI Emoji"/>
+          <w:b/>
+          <w:bCs/>
+        </w:rPr>
+        <w:br/>
+        <w:t>• Step 12.2.3.2 — Add advanced coaching features</w:t>
+      </w:r>
+      <w:r>
+        <w:rPr>
+          <w:rFonts w:ascii="Segoe UI Emoji" w:hAnsi="Segoe UI Emoji" w:cs="Segoe UI Emoji"/>
+          <w:b/>
+          <w:bCs/>
+        </w:rPr>
+        <w:br/>
+        <w:t>• Step 12.2.3.3 — Add weekly AI reports (Pro+)</w:t>
+      </w:r>
+    </w:p>
+    <w:p>
+      <w:pPr>
+        <w:spacing w:after="0"/>
+        <w:rPr>
+          <w:rFonts w:ascii="Segoe UI Emoji" w:hAnsi="Segoe UI Emoji" w:cs="Segoe UI Emoji"/>
+          <w:b/>
+          <w:bCs/>
+        </w:rPr>
+      </w:pPr>
+      <w:r>
+        <w:rPr>
+          <w:rFonts w:ascii="Segoe UI Emoji" w:hAnsi="Segoe UI Emoji" w:cs="Segoe UI Emoji"/>
+          <w:b/>
+          <w:bCs/>
+        </w:rPr>
+        <w:pict w14:anchorId="2DBC5BC1">
+          <v:rect id="_x0000_i1364" style="width:0;height:1.5pt" o:hralign="center" o:hrstd="t" o:hr="t" fillcolor="#a0a0a0" stroked="f"/>
+        </w:pict>
+      </w:r>
+    </w:p>
+    <w:p>
+      <w:pPr>
+        <w:spacing w:after="0"/>
+        <w:rPr>
+          <w:rFonts w:ascii="Segoe UI Emoji" w:hAnsi="Segoe UI Emoji" w:cs="Segoe UI Emoji"/>
+          <w:b/>
+          <w:bCs/>
+        </w:rPr>
+      </w:pPr>
+      <w:r>
+        <w:rPr>
+          <w:rFonts w:ascii="Segoe UI Emoji" w:hAnsi="Segoe UI Emoji" w:cs="Segoe UI Emoji"/>
+          <w:b/>
+          <w:bCs/>
+        </w:rPr>
+        <w:t>🔹 Feature 12.3 — Payment UX</w:t>
+      </w:r>
+    </w:p>
+    <w:p>
+      <w:pPr>
+        <w:spacing w:after="0"/>
+        <w:rPr>
+          <w:rFonts w:ascii="Segoe UI Emoji" w:hAnsi="Segoe UI Emoji" w:cs="Segoe UI Emoji"/>
+          <w:b/>
+          <w:bCs/>
+        </w:rPr>
+      </w:pPr>
+      <w:r>
+        <w:rPr>
+          <w:rFonts w:ascii="Segoe UI Emoji" w:hAnsi="Segoe UI Emoji" w:cs="Segoe UI Emoji"/>
+          <w:b/>
+          <w:bCs/>
+        </w:rPr>
+        <w:t>Task 12.3.1 — Checkout Experience</w:t>
+      </w:r>
+      <w:r>
+        <w:rPr>
+          <w:rFonts w:ascii="Segoe UI Emoji" w:hAnsi="Segoe UI Emoji" w:cs="Segoe UI Emoji"/>
+          <w:b/>
+          <w:bCs/>
+        </w:rPr>
+        <w:br/>
+        <w:t>• Step 12.3.1.1 — Build pricing page (clear tiers)</w:t>
+      </w:r>
+      <w:r>
+        <w:rPr>
+          <w:rFonts w:ascii="Segoe UI Emoji" w:hAnsi="Segoe UI Emoji" w:cs="Segoe UI Emoji"/>
+          <w:b/>
+          <w:bCs/>
+        </w:rPr>
+        <w:br/>
+        <w:t>• Step 12.3.1.2 — Optimize checkout flow</w:t>
+      </w:r>
+      <w:r>
+        <w:rPr>
+          <w:rFonts w:ascii="Segoe UI Emoji" w:hAnsi="Segoe UI Emoji" w:cs="Segoe UI Emoji"/>
+          <w:b/>
+          <w:bCs/>
+        </w:rPr>
+        <w:br/>
+        <w:t>• Step 12.3.1.3 — Support Apple Pay / Google Pay</w:t>
       </w:r>
     </w:p>
     <w:p>
@@ -5881,25 +6766,7 @@
           <w:bCs/>
         </w:rPr>
         <w:lastRenderedPageBreak/>
-        <w:t>Task 11.1.1 — Billing Integration</w:t>
-      </w:r>
-    </w:p>
-    <w:p>
-      <w:pPr>
-        <w:spacing w:after="0"/>
-        <w:rPr>
-          <w:rFonts w:ascii="Segoe UI Emoji" w:hAnsi="Segoe UI Emoji" w:cs="Segoe UI Emoji"/>
-          <w:b/>
-          <w:bCs/>
-        </w:rPr>
-      </w:pPr>
-      <w:r>
-        <w:rPr>
-          <w:rFonts w:ascii="Segoe UI Emoji" w:hAnsi="Segoe UI Emoji" w:cs="Segoe UI Emoji"/>
-          <w:b/>
-          <w:bCs/>
-        </w:rPr>
-        <w:t>• Step 11.1.1.1 — Integrate Stripe</w:t>
+        <w:t>Task 12.3.2 — Conversion Optimization</w:t>
       </w:r>
       <w:r>
         <w:rPr>
@@ -5908,7 +6775,7 @@
           <w:bCs/>
         </w:rPr>
         <w:br/>
-        <w:t>• Step 11.1.1.2 — Create pricing plans</w:t>
+        <w:t>• Step 12.3.2.1 — Add urgency triggers</w:t>
       </w:r>
       <w:r>
         <w:rPr>
@@ -5917,26 +6784,35 @@
           <w:bCs/>
         </w:rPr>
         <w:br/>
-        <w:t>• Step 11.1.1.3 — Handle subscriptions</w:t>
-      </w:r>
-    </w:p>
-    <w:p>
-      <w:pPr>
-        <w:spacing w:after="0"/>
-        <w:rPr>
-          <w:rFonts w:ascii="Segoe UI Emoji" w:hAnsi="Segoe UI Emoji" w:cs="Segoe UI Emoji"/>
-          <w:b/>
-          <w:bCs/>
-        </w:rPr>
-      </w:pPr>
-      <w:r>
-        <w:rPr>
-          <w:rFonts w:ascii="Segoe UI Emoji" w:hAnsi="Segoe UI Emoji" w:cs="Segoe UI Emoji"/>
-          <w:b/>
-          <w:bCs/>
-        </w:rPr>
-        <w:pict w14:anchorId="1F2C4D96">
-          <v:rect id="_x0000_i1433" style="width:0;height:1.5pt" o:hralign="center" o:hrstd="t" o:hr="t" fillcolor="#a0a0a0" stroked="f"/>
+        <w:t>• Step 12.3.2.2 — Add trust signals</w:t>
+      </w:r>
+      <w:r>
+        <w:rPr>
+          <w:rFonts w:ascii="Segoe UI Emoji" w:hAnsi="Segoe UI Emoji" w:cs="Segoe UI Emoji"/>
+          <w:b/>
+          <w:bCs/>
+        </w:rPr>
+        <w:br/>
+        <w:t>• Step 12.3.2.3 — A/B test pricing layout</w:t>
+      </w:r>
+    </w:p>
+    <w:p>
+      <w:pPr>
+        <w:spacing w:after="0"/>
+        <w:rPr>
+          <w:rFonts w:ascii="Segoe UI Emoji" w:hAnsi="Segoe UI Emoji" w:cs="Segoe UI Emoji"/>
+          <w:b/>
+          <w:bCs/>
+        </w:rPr>
+      </w:pPr>
+      <w:r>
+        <w:rPr>
+          <w:rFonts w:ascii="Segoe UI Emoji" w:hAnsi="Segoe UI Emoji" w:cs="Segoe UI Emoji"/>
+          <w:b/>
+          <w:bCs/>
+        </w:rPr>
+        <w:pict w14:anchorId="2E18C6DE">
+          <v:rect id="_x0000_i1365" style="width:0;height:1.5pt" o:hralign="center" o:hrstd="t" o:hr="t" fillcolor="#a0a0a0" stroked="f"/>
         </w:pict>
       </w:r>
     </w:p>
@@ -5955,43 +6831,63 @@
           <w:b/>
           <w:bCs/>
         </w:rPr>
-        <w:t>🔹 Feature 11.2 — Access Control</w:t>
-      </w:r>
-    </w:p>
-    <w:p>
-      <w:pPr>
-        <w:spacing w:after="0"/>
-        <w:rPr>
-          <w:rFonts w:ascii="Segoe UI Emoji" w:hAnsi="Segoe UI Emoji" w:cs="Segoe UI Emoji"/>
-          <w:b/>
-          <w:bCs/>
-        </w:rPr>
-      </w:pPr>
-      <w:r>
-        <w:rPr>
-          <w:rFonts w:ascii="Segoe UI Emoji" w:hAnsi="Segoe UI Emoji" w:cs="Segoe UI Emoji"/>
-          <w:b/>
-          <w:bCs/>
-        </w:rPr>
-        <w:t>Task 11.2.1 — Feature Gating</w:t>
-      </w:r>
-    </w:p>
-    <w:p>
-      <w:pPr>
-        <w:spacing w:after="0"/>
-        <w:rPr>
-          <w:rFonts w:ascii="Segoe UI Emoji" w:hAnsi="Segoe UI Emoji" w:cs="Segoe UI Emoji"/>
-          <w:b/>
-          <w:bCs/>
-        </w:rPr>
-      </w:pPr>
-      <w:r>
-        <w:rPr>
-          <w:rFonts w:ascii="Segoe UI Emoji" w:hAnsi="Segoe UI Emoji" w:cs="Segoe UI Emoji"/>
-          <w:b/>
-          <w:bCs/>
-        </w:rPr>
-        <w:t>• Step 11.2.1.1 — Define free vs paid features</w:t>
+        <w:t>🔁 PHASE 13 — RETENTION &amp; ENGAGEMENT ENGINE (Habit Loop)</w:t>
+      </w:r>
+    </w:p>
+    <w:p>
+      <w:pPr>
+        <w:spacing w:after="0"/>
+        <w:rPr>
+          <w:rFonts w:ascii="Segoe UI Emoji" w:hAnsi="Segoe UI Emoji" w:cs="Segoe UI Emoji"/>
+          <w:b/>
+          <w:bCs/>
+        </w:rPr>
+      </w:pPr>
+      <w:r>
+        <w:rPr>
+          <w:rFonts w:ascii="Segoe UI Emoji" w:hAnsi="Segoe UI Emoji" w:cs="Segoe UI Emoji"/>
+          <w:b/>
+          <w:bCs/>
+        </w:rPr>
+        <w:pict w14:anchorId="0791FEA1">
+          <v:rect id="_x0000_i1366" style="width:0;height:1.5pt" o:hralign="center" o:hrstd="t" o:hr="t" fillcolor="#a0a0a0" stroked="f"/>
+        </w:pict>
+      </w:r>
+    </w:p>
+    <w:p>
+      <w:pPr>
+        <w:spacing w:after="0"/>
+        <w:rPr>
+          <w:rFonts w:ascii="Segoe UI Emoji" w:hAnsi="Segoe UI Emoji" w:cs="Segoe UI Emoji"/>
+          <w:b/>
+          <w:bCs/>
+        </w:rPr>
+      </w:pPr>
+      <w:r>
+        <w:rPr>
+          <w:rFonts w:ascii="Segoe UI Emoji" w:hAnsi="Segoe UI Emoji" w:cs="Segoe UI Emoji"/>
+          <w:b/>
+          <w:bCs/>
+        </w:rPr>
+        <w:t>🔹 Feature 13.1 — Daily Engagement Loop</w:t>
+      </w:r>
+    </w:p>
+    <w:p>
+      <w:pPr>
+        <w:spacing w:after="0"/>
+        <w:rPr>
+          <w:rFonts w:ascii="Segoe UI Emoji" w:hAnsi="Segoe UI Emoji" w:cs="Segoe UI Emoji"/>
+          <w:b/>
+          <w:bCs/>
+        </w:rPr>
+      </w:pPr>
+      <w:r>
+        <w:rPr>
+          <w:rFonts w:ascii="Segoe UI Emoji" w:hAnsi="Segoe UI Emoji" w:cs="Segoe UI Emoji"/>
+          <w:b/>
+          <w:bCs/>
+        </w:rPr>
+        <w:t>Task 13.1.1 — Core Habit System</w:t>
       </w:r>
       <w:r>
         <w:rPr>
@@ -6000,7 +6896,7 @@
           <w:bCs/>
         </w:rPr>
         <w:br/>
-        <w:t>• Step 11.2.1.2 — Implement access middleware</w:t>
+        <w:t>• Step 13.1.1.1 — Daily check-in (weight, mood, adherence)</w:t>
       </w:r>
       <w:r>
         <w:rPr>
@@ -6009,26 +6905,80 @@
           <w:bCs/>
         </w:rPr>
         <w:br/>
-        <w:t>• Step 11.2.1.3 — Upgrade prompts</w:t>
-      </w:r>
-    </w:p>
-    <w:p>
-      <w:pPr>
-        <w:spacing w:after="0"/>
-        <w:rPr>
-          <w:rFonts w:ascii="Segoe UI Emoji" w:hAnsi="Segoe UI Emoji" w:cs="Segoe UI Emoji"/>
-          <w:b/>
-          <w:bCs/>
-        </w:rPr>
-      </w:pPr>
-      <w:r>
-        <w:rPr>
-          <w:rFonts w:ascii="Segoe UI Emoji" w:hAnsi="Segoe UI Emoji" w:cs="Segoe UI Emoji"/>
-          <w:b/>
-          <w:bCs/>
-        </w:rPr>
-        <w:pict w14:anchorId="01A941F2">
-          <v:rect id="_x0000_i1434" style="width:0;height:1.5pt" o:hralign="center" o:hrstd="t" o:hr="t" fillcolor="#a0a0a0" stroked="f"/>
+        <w:t>• Step 13.1.1.2 — Daily AI feedback loop</w:t>
+      </w:r>
+      <w:r>
+        <w:rPr>
+          <w:rFonts w:ascii="Segoe UI Emoji" w:hAnsi="Segoe UI Emoji" w:cs="Segoe UI Emoji"/>
+          <w:b/>
+          <w:bCs/>
+        </w:rPr>
+        <w:br/>
+        <w:t>• Step 13.1.1.3 — “What should I eat today?” interaction</w:t>
+      </w:r>
+    </w:p>
+    <w:p>
+      <w:pPr>
+        <w:spacing w:after="0"/>
+        <w:rPr>
+          <w:rFonts w:ascii="Segoe UI Emoji" w:hAnsi="Segoe UI Emoji" w:cs="Segoe UI Emoji"/>
+          <w:b/>
+          <w:bCs/>
+        </w:rPr>
+      </w:pPr>
+      <w:r>
+        <w:rPr>
+          <w:rFonts w:ascii="Segoe UI Emoji" w:hAnsi="Segoe UI Emoji" w:cs="Segoe UI Emoji"/>
+          <w:b/>
+          <w:bCs/>
+        </w:rPr>
+        <w:t>Task 13.1.2 — Progress Tracking</w:t>
+      </w:r>
+      <w:r>
+        <w:rPr>
+          <w:rFonts w:ascii="Segoe UI Emoji" w:hAnsi="Segoe UI Emoji" w:cs="Segoe UI Emoji"/>
+          <w:b/>
+          <w:bCs/>
+        </w:rPr>
+        <w:br/>
+        <w:t>• Step 13.1.2.1 — Weight tracking graph</w:t>
+      </w:r>
+      <w:r>
+        <w:rPr>
+          <w:rFonts w:ascii="Segoe UI Emoji" w:hAnsi="Segoe UI Emoji" w:cs="Segoe UI Emoji"/>
+          <w:b/>
+          <w:bCs/>
+        </w:rPr>
+        <w:br/>
+        <w:t>• Step 13.1.2.2 — AI-generated progress insights</w:t>
+      </w:r>
+      <w:r>
+        <w:rPr>
+          <w:rFonts w:ascii="Segoe UI Emoji" w:hAnsi="Segoe UI Emoji" w:cs="Segoe UI Emoji"/>
+          <w:b/>
+          <w:bCs/>
+        </w:rPr>
+        <w:br/>
+        <w:t>• Step 13.1.2.3 — Goal tracking system</w:t>
+      </w:r>
+    </w:p>
+    <w:p>
+      <w:pPr>
+        <w:spacing w:after="0"/>
+        <w:rPr>
+          <w:rFonts w:ascii="Segoe UI Emoji" w:hAnsi="Segoe UI Emoji" w:cs="Segoe UI Emoji"/>
+          <w:b/>
+          <w:bCs/>
+        </w:rPr>
+      </w:pPr>
+      <w:r>
+        <w:rPr>
+          <w:rFonts w:ascii="Segoe UI Emoji" w:hAnsi="Segoe UI Emoji" w:cs="Segoe UI Emoji"/>
+          <w:b/>
+          <w:bCs/>
+        </w:rPr>
+        <w:pict w14:anchorId="06E22103">
+          <v:rect id="_x0000_i1367" style="width:0;height:1.5pt" o:hralign="center" o:hrstd="t" o:hr="t" fillcolor="#a0a0a0" stroked="f"/>
         </w:pict>
       </w:r>
     </w:p>
@@ -6047,43 +6997,25 @@
           <w:b/>
           <w:bCs/>
         </w:rPr>
-        <w:t>🔹 Feature 11.3 — Payment UX</w:t>
-      </w:r>
-    </w:p>
-    <w:p>
-      <w:pPr>
-        <w:spacing w:after="0"/>
-        <w:rPr>
-          <w:rFonts w:ascii="Segoe UI Emoji" w:hAnsi="Segoe UI Emoji" w:cs="Segoe UI Emoji"/>
-          <w:b/>
-          <w:bCs/>
-        </w:rPr>
-      </w:pPr>
-      <w:r>
-        <w:rPr>
-          <w:rFonts w:ascii="Segoe UI Emoji" w:hAnsi="Segoe UI Emoji" w:cs="Segoe UI Emoji"/>
-          <w:b/>
-          <w:bCs/>
-        </w:rPr>
-        <w:t>Task 11.3.1 — Checkout Experience</w:t>
-      </w:r>
-    </w:p>
-    <w:p>
-      <w:pPr>
-        <w:spacing w:after="0"/>
-        <w:rPr>
-          <w:rFonts w:ascii="Segoe UI Emoji" w:hAnsi="Segoe UI Emoji" w:cs="Segoe UI Emoji"/>
-          <w:b/>
-          <w:bCs/>
-        </w:rPr>
-      </w:pPr>
-      <w:r>
-        <w:rPr>
-          <w:rFonts w:ascii="Segoe UI Emoji" w:hAnsi="Segoe UI Emoji" w:cs="Segoe UI Emoji"/>
-          <w:b/>
-          <w:bCs/>
-        </w:rPr>
-        <w:t>• Step 11.3.1.1 — Pricing page</w:t>
+        <w:t>🔹 Feature 13.2 — Notifications &amp; Re-engagement</w:t>
+      </w:r>
+    </w:p>
+    <w:p>
+      <w:pPr>
+        <w:spacing w:after="0"/>
+        <w:rPr>
+          <w:rFonts w:ascii="Segoe UI Emoji" w:hAnsi="Segoe UI Emoji" w:cs="Segoe UI Emoji"/>
+          <w:b/>
+          <w:bCs/>
+        </w:rPr>
+      </w:pPr>
+      <w:r>
+        <w:rPr>
+          <w:rFonts w:ascii="Segoe UI Emoji" w:hAnsi="Segoe UI Emoji" w:cs="Segoe UI Emoji"/>
+          <w:b/>
+          <w:bCs/>
+        </w:rPr>
+        <w:t>Task 13.2.1 — Notification System</w:t>
       </w:r>
       <w:r>
         <w:rPr>
@@ -6092,7 +7024,7 @@
           <w:bCs/>
         </w:rPr>
         <w:br/>
-        <w:t>• Step 11.3.1.2 — Smooth checkout flow</w:t>
+        <w:t>• Step 13.2.1.1 — Push/email reminders</w:t>
       </w:r>
       <w:r>
         <w:rPr>
@@ -6101,26 +7033,80 @@
           <w:bCs/>
         </w:rPr>
         <w:br/>
-        <w:t>• Step 11.3.1.3 — Handle failures</w:t>
-      </w:r>
-    </w:p>
-    <w:p>
-      <w:pPr>
-        <w:spacing w:after="0"/>
-        <w:rPr>
-          <w:rFonts w:ascii="Segoe UI Emoji" w:hAnsi="Segoe UI Emoji" w:cs="Segoe UI Emoji"/>
-          <w:b/>
-          <w:bCs/>
-        </w:rPr>
-      </w:pPr>
-      <w:r>
-        <w:rPr>
-          <w:rFonts w:ascii="Segoe UI Emoji" w:hAnsi="Segoe UI Emoji" w:cs="Segoe UI Emoji"/>
-          <w:b/>
-          <w:bCs/>
-        </w:rPr>
-        <w:pict w14:anchorId="55539B35">
-          <v:rect id="_x0000_i1435" style="width:0;height:1.5pt" o:hralign="center" o:hrstd="t" o:hr="t" fillcolor="#a0a0a0" stroked="f"/>
+        <w:t>• Step 13.2.1.2 — Missed activity alerts</w:t>
+      </w:r>
+      <w:r>
+        <w:rPr>
+          <w:rFonts w:ascii="Segoe UI Emoji" w:hAnsi="Segoe UI Emoji" w:cs="Segoe UI Emoji"/>
+          <w:b/>
+          <w:bCs/>
+        </w:rPr>
+        <w:br/>
+        <w:t>• Step 13.2.1.3 — Goal proximity nudges</w:t>
+      </w:r>
+    </w:p>
+    <w:p>
+      <w:pPr>
+        <w:spacing w:after="0"/>
+        <w:rPr>
+          <w:rFonts w:ascii="Segoe UI Emoji" w:hAnsi="Segoe UI Emoji" w:cs="Segoe UI Emoji"/>
+          <w:b/>
+          <w:bCs/>
+        </w:rPr>
+      </w:pPr>
+      <w:r>
+        <w:rPr>
+          <w:rFonts w:ascii="Segoe UI Emoji" w:hAnsi="Segoe UI Emoji" w:cs="Segoe UI Emoji"/>
+          <w:b/>
+          <w:bCs/>
+        </w:rPr>
+        <w:t>Task 13.2.2 — Streak &amp; Gamification</w:t>
+      </w:r>
+      <w:r>
+        <w:rPr>
+          <w:rFonts w:ascii="Segoe UI Emoji" w:hAnsi="Segoe UI Emoji" w:cs="Segoe UI Emoji"/>
+          <w:b/>
+          <w:bCs/>
+        </w:rPr>
+        <w:br/>
+        <w:t>• Step 13.2.2.1 — Daily streak tracking</w:t>
+      </w:r>
+      <w:r>
+        <w:rPr>
+          <w:rFonts w:ascii="Segoe UI Emoji" w:hAnsi="Segoe UI Emoji" w:cs="Segoe UI Emoji"/>
+          <w:b/>
+          <w:bCs/>
+        </w:rPr>
+        <w:br/>
+        <w:t>• Step 13.2.2.2 — Reward milestones</w:t>
+      </w:r>
+      <w:r>
+        <w:rPr>
+          <w:rFonts w:ascii="Segoe UI Emoji" w:hAnsi="Segoe UI Emoji" w:cs="Segoe UI Emoji"/>
+          <w:b/>
+          <w:bCs/>
+        </w:rPr>
+        <w:br/>
+        <w:t>• Step 13.2.2.3 — Engagement badges</w:t>
+      </w:r>
+    </w:p>
+    <w:p>
+      <w:pPr>
+        <w:spacing w:after="0"/>
+        <w:rPr>
+          <w:rFonts w:ascii="Segoe UI Emoji" w:hAnsi="Segoe UI Emoji" w:cs="Segoe UI Emoji"/>
+          <w:b/>
+          <w:bCs/>
+        </w:rPr>
+      </w:pPr>
+      <w:r>
+        <w:rPr>
+          <w:rFonts w:ascii="Segoe UI Emoji" w:hAnsi="Segoe UI Emoji" w:cs="Segoe UI Emoji"/>
+          <w:b/>
+          <w:bCs/>
+        </w:rPr>
+        <w:pict w14:anchorId="2C191E3F">
+          <v:rect id="_x0000_i1368" style="width:0;height:1.5pt" o:hralign="center" o:hrstd="t" o:hr="t" fillcolor="#a0a0a0" stroked="f"/>
         </w:pict>
       </w:r>
     </w:p>
@@ -6139,26 +7125,71 @@
           <w:b/>
           <w:bCs/>
         </w:rPr>
-        <w:t>🚀 PHASE 12 — SCALE &amp; PRODUCTION MATURITY</w:t>
-      </w:r>
-    </w:p>
-    <w:p>
-      <w:pPr>
-        <w:spacing w:after="0"/>
-        <w:rPr>
-          <w:rFonts w:ascii="Segoe UI Emoji" w:hAnsi="Segoe UI Emoji" w:cs="Segoe UI Emoji"/>
-          <w:b/>
-          <w:bCs/>
-        </w:rPr>
-      </w:pPr>
-      <w:r>
-        <w:rPr>
-          <w:rFonts w:ascii="Segoe UI Emoji" w:hAnsi="Segoe UI Emoji" w:cs="Segoe UI Emoji"/>
-          <w:b/>
-          <w:bCs/>
-        </w:rPr>
-        <w:pict w14:anchorId="0376263D">
-          <v:rect id="_x0000_i1436" style="width:0;height:1.5pt" o:hralign="center" o:hrstd="t" o:hr="t" fillcolor="#a0a0a0" stroked="f"/>
+        <w:t>🔹 Feature 13.3 — Weekly Retention Hooks</w:t>
+      </w:r>
+    </w:p>
+    <w:p>
+      <w:pPr>
+        <w:spacing w:after="0"/>
+        <w:rPr>
+          <w:rFonts w:ascii="Segoe UI Emoji" w:hAnsi="Segoe UI Emoji" w:cs="Segoe UI Emoji"/>
+          <w:b/>
+          <w:bCs/>
+        </w:rPr>
+      </w:pPr>
+      <w:r>
+        <w:rPr>
+          <w:rFonts w:ascii="Segoe UI Emoji" w:hAnsi="Segoe UI Emoji" w:cs="Segoe UI Emoji"/>
+          <w:b/>
+          <w:bCs/>
+        </w:rPr>
+        <w:t>Task 13.3.1 — AI Reports</w:t>
+      </w:r>
+      <w:r>
+        <w:rPr>
+          <w:rFonts w:ascii="Segoe UI Emoji" w:hAnsi="Segoe UI Emoji" w:cs="Segoe UI Emoji"/>
+          <w:b/>
+          <w:bCs/>
+        </w:rPr>
+        <w:br/>
+        <w:t>• Step 13.3.1.1 — Weekly progress report</w:t>
+      </w:r>
+      <w:r>
+        <w:rPr>
+          <w:rFonts w:ascii="Segoe UI Emoji" w:hAnsi="Segoe UI Emoji" w:cs="Segoe UI Emoji"/>
+          <w:b/>
+          <w:bCs/>
+        </w:rPr>
+        <w:br/>
+        <w:t>• Step 13.3.1.2 — Plan adjustments</w:t>
+      </w:r>
+      <w:r>
+        <w:rPr>
+          <w:rFonts w:ascii="Segoe UI Emoji" w:hAnsi="Segoe UI Emoji" w:cs="Segoe UI Emoji"/>
+          <w:b/>
+          <w:bCs/>
+        </w:rPr>
+        <w:br/>
+        <w:t>• Step 13.3.1.3 — Behavioral insights</w:t>
+      </w:r>
+    </w:p>
+    <w:p>
+      <w:pPr>
+        <w:spacing w:after="0"/>
+        <w:rPr>
+          <w:rFonts w:ascii="Segoe UI Emoji" w:hAnsi="Segoe UI Emoji" w:cs="Segoe UI Emoji"/>
+          <w:b/>
+          <w:bCs/>
+        </w:rPr>
+      </w:pPr>
+      <w:r>
+        <w:rPr>
+          <w:rFonts w:ascii="Segoe UI Emoji" w:hAnsi="Segoe UI Emoji" w:cs="Segoe UI Emoji"/>
+          <w:b/>
+          <w:bCs/>
+        </w:rPr>
+        <w:pict w14:anchorId="5AAA2C87">
+          <v:rect id="_x0000_i1369" style="width:0;height:1.5pt" o:hralign="center" o:hrstd="t" o:hr="t" fillcolor="#a0a0a0" stroked="f"/>
         </w:pict>
       </w:r>
     </w:p>
@@ -6177,43 +7208,112 @@
           <w:b/>
           <w:bCs/>
         </w:rPr>
-        <w:t>🔹 Feature 12.1 — Infrastructure Scaling</w:t>
-      </w:r>
-    </w:p>
-    <w:p>
-      <w:pPr>
-        <w:spacing w:after="0"/>
-        <w:rPr>
-          <w:rFonts w:ascii="Segoe UI Emoji" w:hAnsi="Segoe UI Emoji" w:cs="Segoe UI Emoji"/>
-          <w:b/>
-          <w:bCs/>
-        </w:rPr>
-      </w:pPr>
-      <w:r>
-        <w:rPr>
-          <w:rFonts w:ascii="Segoe UI Emoji" w:hAnsi="Segoe UI Emoji" w:cs="Segoe UI Emoji"/>
-          <w:b/>
-          <w:bCs/>
-        </w:rPr>
-        <w:t>Task 12.1.1 — Deployment Architecture</w:t>
-      </w:r>
-    </w:p>
-    <w:p>
-      <w:pPr>
-        <w:spacing w:after="0"/>
-        <w:rPr>
-          <w:rFonts w:ascii="Segoe UI Emoji" w:hAnsi="Segoe UI Emoji" w:cs="Segoe UI Emoji"/>
-          <w:b/>
-          <w:bCs/>
-        </w:rPr>
-      </w:pPr>
-      <w:r>
-        <w:rPr>
-          <w:rFonts w:ascii="Segoe UI Emoji" w:hAnsi="Segoe UI Emoji" w:cs="Segoe UI Emoji"/>
-          <w:b/>
-          <w:bCs/>
-        </w:rPr>
-        <w:t>• Step 12.1.1.1 — Containerization</w:t>
+        <w:t>🚀 PHASE 1</w:t>
+      </w:r>
+      <w:r>
+        <w:rPr>
+          <w:rFonts w:ascii="Segoe UI Emoji" w:hAnsi="Segoe UI Emoji" w:cs="Segoe UI Emoji"/>
+          <w:b/>
+          <w:bCs/>
+        </w:rPr>
+        <w:t>5</w:t>
+      </w:r>
+      <w:r>
+        <w:rPr>
+          <w:rFonts w:ascii="Segoe UI Emoji" w:hAnsi="Segoe UI Emoji" w:cs="Segoe UI Emoji"/>
+          <w:b/>
+          <w:bCs/>
+        </w:rPr>
+        <w:t xml:space="preserve"> — SCALE &amp; PRODUCTION MATURITY</w:t>
+      </w:r>
+    </w:p>
+    <w:p>
+      <w:pPr>
+        <w:spacing w:after="0"/>
+        <w:rPr>
+          <w:rFonts w:ascii="Segoe UI Emoji" w:hAnsi="Segoe UI Emoji" w:cs="Segoe UI Emoji"/>
+          <w:b/>
+          <w:bCs/>
+        </w:rPr>
+      </w:pPr>
+      <w:r>
+        <w:rPr>
+          <w:rFonts w:ascii="Segoe UI Emoji" w:hAnsi="Segoe UI Emoji" w:cs="Segoe UI Emoji"/>
+          <w:b/>
+          <w:bCs/>
+        </w:rPr>
+        <w:pict w14:anchorId="4D7B287C">
+          <v:rect id="_x0000_i1370" style="width:0;height:1.5pt" o:hralign="center" o:hrstd="t" o:hr="t" fillcolor="#a0a0a0" stroked="f"/>
+        </w:pict>
+      </w:r>
+    </w:p>
+    <w:p>
+      <w:pPr>
+        <w:spacing w:after="0"/>
+        <w:rPr>
+          <w:rFonts w:ascii="Segoe UI Emoji" w:hAnsi="Segoe UI Emoji" w:cs="Segoe UI Emoji"/>
+          <w:b/>
+          <w:bCs/>
+        </w:rPr>
+      </w:pPr>
+      <w:r>
+        <w:rPr>
+          <w:rFonts w:ascii="Segoe UI Emoji" w:hAnsi="Segoe UI Emoji" w:cs="Segoe UI Emoji"/>
+          <w:b/>
+          <w:bCs/>
+        </w:rPr>
+        <w:lastRenderedPageBreak/>
+        <w:t>🔹 Feature 1</w:t>
+      </w:r>
+      <w:r>
+        <w:rPr>
+          <w:rFonts w:ascii="Segoe UI Emoji" w:hAnsi="Segoe UI Emoji" w:cs="Segoe UI Emoji"/>
+          <w:b/>
+          <w:bCs/>
+        </w:rPr>
+        <w:t>5</w:t>
+      </w:r>
+      <w:r>
+        <w:rPr>
+          <w:rFonts w:ascii="Segoe UI Emoji" w:hAnsi="Segoe UI Emoji" w:cs="Segoe UI Emoji"/>
+          <w:b/>
+          <w:bCs/>
+        </w:rPr>
+        <w:t>.1 — Infrastructure Scaling</w:t>
+      </w:r>
+    </w:p>
+    <w:p>
+      <w:pPr>
+        <w:spacing w:after="0"/>
+        <w:rPr>
+          <w:rFonts w:ascii="Segoe UI Emoji" w:hAnsi="Segoe UI Emoji" w:cs="Segoe UI Emoji"/>
+          <w:b/>
+          <w:bCs/>
+        </w:rPr>
+      </w:pPr>
+      <w:r>
+        <w:rPr>
+          <w:rFonts w:ascii="Segoe UI Emoji" w:hAnsi="Segoe UI Emoji" w:cs="Segoe UI Emoji"/>
+          <w:b/>
+          <w:bCs/>
+        </w:rPr>
+        <w:t>Task 1</w:t>
+      </w:r>
+      <w:r>
+        <w:rPr>
+          <w:rFonts w:ascii="Segoe UI Emoji" w:hAnsi="Segoe UI Emoji" w:cs="Segoe UI Emoji"/>
+          <w:b/>
+          <w:bCs/>
+        </w:rPr>
+        <w:t>5</w:t>
+      </w:r>
+      <w:r>
+        <w:rPr>
+          <w:rFonts w:ascii="Segoe UI Emoji" w:hAnsi="Segoe UI Emoji" w:cs="Segoe UI Emoji"/>
+          <w:b/>
+          <w:bCs/>
+        </w:rPr>
+        <w:t>.1.1 — Deployment Architecture</w:t>
       </w:r>
       <w:r>
         <w:rPr>
@@ -6222,7 +7322,23 @@
           <w:bCs/>
         </w:rPr>
         <w:br/>
-        <w:t>• Step 12.1.1.2 — Load balancing</w:t>
+        <w:t>• Step 1</w:t>
+      </w:r>
+      <w:r>
+        <w:rPr>
+          <w:rFonts w:ascii="Segoe UI Emoji" w:hAnsi="Segoe UI Emoji" w:cs="Segoe UI Emoji"/>
+          <w:b/>
+          <w:bCs/>
+        </w:rPr>
+        <w:t>5</w:t>
+      </w:r>
+      <w:r>
+        <w:rPr>
+          <w:rFonts w:ascii="Segoe UI Emoji" w:hAnsi="Segoe UI Emoji" w:cs="Segoe UI Emoji"/>
+          <w:b/>
+          <w:bCs/>
+        </w:rPr>
+        <w:t>.1.1.1 — Containerization (Docker)</w:t>
       </w:r>
       <w:r>
         <w:rPr>
@@ -6231,26 +7347,67 @@
           <w:bCs/>
         </w:rPr>
         <w:br/>
-        <w:t>• Step 12.1.1.3 — Horizontal scaling</w:t>
-      </w:r>
-    </w:p>
-    <w:p>
-      <w:pPr>
-        <w:spacing w:after="0"/>
-        <w:rPr>
-          <w:rFonts w:ascii="Segoe UI Emoji" w:hAnsi="Segoe UI Emoji" w:cs="Segoe UI Emoji"/>
-          <w:b/>
-          <w:bCs/>
-        </w:rPr>
-      </w:pPr>
-      <w:r>
-        <w:rPr>
-          <w:rFonts w:ascii="Segoe UI Emoji" w:hAnsi="Segoe UI Emoji" w:cs="Segoe UI Emoji"/>
-          <w:b/>
-          <w:bCs/>
-        </w:rPr>
-        <w:pict w14:anchorId="66A592E7">
-          <v:rect id="_x0000_i1437" style="width:0;height:1.5pt" o:hralign="center" o:hrstd="t" o:hr="t" fillcolor="#a0a0a0" stroked="f"/>
+        <w:t>• Step 1</w:t>
+      </w:r>
+      <w:r>
+        <w:rPr>
+          <w:rFonts w:ascii="Segoe UI Emoji" w:hAnsi="Segoe UI Emoji" w:cs="Segoe UI Emoji"/>
+          <w:b/>
+          <w:bCs/>
+        </w:rPr>
+        <w:t>5</w:t>
+      </w:r>
+      <w:r>
+        <w:rPr>
+          <w:rFonts w:ascii="Segoe UI Emoji" w:hAnsi="Segoe UI Emoji" w:cs="Segoe UI Emoji"/>
+          <w:b/>
+          <w:bCs/>
+        </w:rPr>
+        <w:t>.1.1.2 — Load balancing</w:t>
+      </w:r>
+      <w:r>
+        <w:rPr>
+          <w:rFonts w:ascii="Segoe UI Emoji" w:hAnsi="Segoe UI Emoji" w:cs="Segoe UI Emoji"/>
+          <w:b/>
+          <w:bCs/>
+        </w:rPr>
+        <w:br/>
+        <w:t>• Step 1</w:t>
+      </w:r>
+      <w:r>
+        <w:rPr>
+          <w:rFonts w:ascii="Segoe UI Emoji" w:hAnsi="Segoe UI Emoji" w:cs="Segoe UI Emoji"/>
+          <w:b/>
+          <w:bCs/>
+        </w:rPr>
+        <w:t>5</w:t>
+      </w:r>
+      <w:r>
+        <w:rPr>
+          <w:rFonts w:ascii="Segoe UI Emoji" w:hAnsi="Segoe UI Emoji" w:cs="Segoe UI Emoji"/>
+          <w:b/>
+          <w:bCs/>
+        </w:rPr>
+        <w:t>.1.1.3 — Horizontal scaling</w:t>
+      </w:r>
+    </w:p>
+    <w:p>
+      <w:pPr>
+        <w:spacing w:after="0"/>
+        <w:rPr>
+          <w:rFonts w:ascii="Segoe UI Emoji" w:hAnsi="Segoe UI Emoji" w:cs="Segoe UI Emoji"/>
+          <w:b/>
+          <w:bCs/>
+        </w:rPr>
+      </w:pPr>
+      <w:r>
+        <w:rPr>
+          <w:rFonts w:ascii="Segoe UI Emoji" w:hAnsi="Segoe UI Emoji" w:cs="Segoe UI Emoji"/>
+          <w:b/>
+          <w:bCs/>
+        </w:rPr>
+        <w:pict w14:anchorId="08CCF70A">
+          <v:rect id="_x0000_i1371" style="width:0;height:1.5pt" o:hralign="center" o:hrstd="t" o:hr="t" fillcolor="#a0a0a0" stroked="f"/>
         </w:pict>
       </w:r>
     </w:p>
@@ -6269,43 +7426,57 @@
           <w:b/>
           <w:bCs/>
         </w:rPr>
-        <w:t>🔹 Feature 12.2 — AI Cost Optimization</w:t>
-      </w:r>
-    </w:p>
-    <w:p>
-      <w:pPr>
-        <w:spacing w:after="0"/>
-        <w:rPr>
-          <w:rFonts w:ascii="Segoe UI Emoji" w:hAnsi="Segoe UI Emoji" w:cs="Segoe UI Emoji"/>
-          <w:b/>
-          <w:bCs/>
-        </w:rPr>
-      </w:pPr>
-      <w:r>
-        <w:rPr>
-          <w:rFonts w:ascii="Segoe UI Emoji" w:hAnsi="Segoe UI Emoji" w:cs="Segoe UI Emoji"/>
-          <w:b/>
-          <w:bCs/>
-        </w:rPr>
-        <w:t>Task 12.2.1 — Token Efficiency</w:t>
-      </w:r>
-    </w:p>
-    <w:p>
-      <w:pPr>
-        <w:spacing w:after="0"/>
-        <w:rPr>
-          <w:rFonts w:ascii="Segoe UI Emoji" w:hAnsi="Segoe UI Emoji" w:cs="Segoe UI Emoji"/>
-          <w:b/>
-          <w:bCs/>
-        </w:rPr>
-      </w:pPr>
-      <w:r>
-        <w:rPr>
-          <w:rFonts w:ascii="Segoe UI Emoji" w:hAnsi="Segoe UI Emoji" w:cs="Segoe UI Emoji"/>
-          <w:b/>
-          <w:bCs/>
-        </w:rPr>
-        <w:t>• Step 12.2.1.1 — Prompt optimization</w:t>
+        <w:t>🔹 Feature 1</w:t>
+      </w:r>
+      <w:r>
+        <w:rPr>
+          <w:rFonts w:ascii="Segoe UI Emoji" w:hAnsi="Segoe UI Emoji" w:cs="Segoe UI Emoji"/>
+          <w:b/>
+          <w:bCs/>
+        </w:rPr>
+        <w:t>5</w:t>
+      </w:r>
+      <w:r>
+        <w:rPr>
+          <w:rFonts w:ascii="Segoe UI Emoji" w:hAnsi="Segoe UI Emoji" w:cs="Segoe UI Emoji"/>
+          <w:b/>
+          <w:bCs/>
+        </w:rPr>
+        <w:t>.2 — AI Cost Optimization</w:t>
+      </w:r>
+    </w:p>
+    <w:p>
+      <w:pPr>
+        <w:spacing w:after="0"/>
+        <w:rPr>
+          <w:rFonts w:ascii="Segoe UI Emoji" w:hAnsi="Segoe UI Emoji" w:cs="Segoe UI Emoji"/>
+          <w:b/>
+          <w:bCs/>
+        </w:rPr>
+      </w:pPr>
+      <w:r>
+        <w:rPr>
+          <w:rFonts w:ascii="Segoe UI Emoji" w:hAnsi="Segoe UI Emoji" w:cs="Segoe UI Emoji"/>
+          <w:b/>
+          <w:bCs/>
+        </w:rPr>
+        <w:t>Task 1</w:t>
+      </w:r>
+      <w:r>
+        <w:rPr>
+          <w:rFonts w:ascii="Segoe UI Emoji" w:hAnsi="Segoe UI Emoji" w:cs="Segoe UI Emoji"/>
+          <w:b/>
+          <w:bCs/>
+        </w:rPr>
+        <w:t>5</w:t>
+      </w:r>
+      <w:r>
+        <w:rPr>
+          <w:rFonts w:ascii="Segoe UI Emoji" w:hAnsi="Segoe UI Emoji" w:cs="Segoe UI Emoji"/>
+          <w:b/>
+          <w:bCs/>
+        </w:rPr>
+        <w:t>.2.1 — Token Efficiency</w:t>
       </w:r>
       <w:r>
         <w:rPr>
@@ -6314,7 +7485,23 @@
           <w:bCs/>
         </w:rPr>
         <w:br/>
-        <w:t>• Step 12.2.1.2 — Response caching</w:t>
+        <w:t>• Step 1</w:t>
+      </w:r>
+      <w:r>
+        <w:rPr>
+          <w:rFonts w:ascii="Segoe UI Emoji" w:hAnsi="Segoe UI Emoji" w:cs="Segoe UI Emoji"/>
+          <w:b/>
+          <w:bCs/>
+        </w:rPr>
+        <w:t>5</w:t>
+      </w:r>
+      <w:r>
+        <w:rPr>
+          <w:rFonts w:ascii="Segoe UI Emoji" w:hAnsi="Segoe UI Emoji" w:cs="Segoe UI Emoji"/>
+          <w:b/>
+          <w:bCs/>
+        </w:rPr>
+        <w:t>.2.1.1 — Prompt optimization</w:t>
       </w:r>
       <w:r>
         <w:rPr>
@@ -6323,26 +7510,67 @@
           <w:bCs/>
         </w:rPr>
         <w:br/>
-        <w:t>• Step 12.2.1.3 — Model routing tuning</w:t>
-      </w:r>
-    </w:p>
-    <w:p>
-      <w:pPr>
-        <w:spacing w:after="0"/>
-        <w:rPr>
-          <w:rFonts w:ascii="Segoe UI Emoji" w:hAnsi="Segoe UI Emoji" w:cs="Segoe UI Emoji"/>
-          <w:b/>
-          <w:bCs/>
-        </w:rPr>
-      </w:pPr>
-      <w:r>
-        <w:rPr>
-          <w:rFonts w:ascii="Segoe UI Emoji" w:hAnsi="Segoe UI Emoji" w:cs="Segoe UI Emoji"/>
-          <w:b/>
-          <w:bCs/>
-        </w:rPr>
-        <w:pict w14:anchorId="79019037">
-          <v:rect id="_x0000_i1438" style="width:0;height:1.5pt" o:hralign="center" o:hrstd="t" o:hr="t" fillcolor="#a0a0a0" stroked="f"/>
+        <w:t>• Step 1</w:t>
+      </w:r>
+      <w:r>
+        <w:rPr>
+          <w:rFonts w:ascii="Segoe UI Emoji" w:hAnsi="Segoe UI Emoji" w:cs="Segoe UI Emoji"/>
+          <w:b/>
+          <w:bCs/>
+        </w:rPr>
+        <w:t>5</w:t>
+      </w:r>
+      <w:r>
+        <w:rPr>
+          <w:rFonts w:ascii="Segoe UI Emoji" w:hAnsi="Segoe UI Emoji" w:cs="Segoe UI Emoji"/>
+          <w:b/>
+          <w:bCs/>
+        </w:rPr>
+        <w:t>.2.1.2 — Response caching</w:t>
+      </w:r>
+      <w:r>
+        <w:rPr>
+          <w:rFonts w:ascii="Segoe UI Emoji" w:hAnsi="Segoe UI Emoji" w:cs="Segoe UI Emoji"/>
+          <w:b/>
+          <w:bCs/>
+        </w:rPr>
+        <w:br/>
+        <w:t>• Step 1</w:t>
+      </w:r>
+      <w:r>
+        <w:rPr>
+          <w:rFonts w:ascii="Segoe UI Emoji" w:hAnsi="Segoe UI Emoji" w:cs="Segoe UI Emoji"/>
+          <w:b/>
+          <w:bCs/>
+        </w:rPr>
+        <w:t>5</w:t>
+      </w:r>
+      <w:r>
+        <w:rPr>
+          <w:rFonts w:ascii="Segoe UI Emoji" w:hAnsi="Segoe UI Emoji" w:cs="Segoe UI Emoji"/>
+          <w:b/>
+          <w:bCs/>
+        </w:rPr>
+        <w:t>.2.1.3 — Model routing</w:t>
+      </w:r>
+    </w:p>
+    <w:p>
+      <w:pPr>
+        <w:spacing w:after="0"/>
+        <w:rPr>
+          <w:rFonts w:ascii="Segoe UI Emoji" w:hAnsi="Segoe UI Emoji" w:cs="Segoe UI Emoji"/>
+          <w:b/>
+          <w:bCs/>
+        </w:rPr>
+      </w:pPr>
+      <w:r>
+        <w:rPr>
+          <w:rFonts w:ascii="Segoe UI Emoji" w:hAnsi="Segoe UI Emoji" w:cs="Segoe UI Emoji"/>
+          <w:b/>
+          <w:bCs/>
+        </w:rPr>
+        <w:pict w14:anchorId="3A2DF3E1">
+          <v:rect id="_x0000_i1372" style="width:0;height:1.5pt" o:hralign="center" o:hrstd="t" o:hr="t" fillcolor="#a0a0a0" stroked="f"/>
         </w:pict>
       </w:r>
     </w:p>
@@ -6361,36 +7589,634 @@
           <w:b/>
           <w:bCs/>
         </w:rPr>
-        <w:t>🔹 Feature 12.3 — Data Privacy &amp; Compliance</w:t>
-      </w:r>
-    </w:p>
-    <w:p>
-      <w:pPr>
-        <w:spacing w:after="0"/>
-        <w:rPr>
-          <w:rFonts w:ascii="Segoe UI Emoji" w:hAnsi="Segoe UI Emoji" w:cs="Segoe UI Emoji"/>
-          <w:b/>
-          <w:bCs/>
-        </w:rPr>
-      </w:pPr>
-      <w:r>
-        <w:rPr>
-          <w:rFonts w:ascii="Segoe UI Emoji" w:hAnsi="Segoe UI Emoji" w:cs="Segoe UI Emoji"/>
-          <w:b/>
-          <w:bCs/>
-        </w:rPr>
-        <w:t>Task 12.3.1 — Compliance Layer</w:t>
-      </w:r>
-    </w:p>
-    <w:p>
-      <w:pPr>
-        <w:spacing w:after="0"/>
-        <w:rPr>
-          <w:rFonts w:ascii="Segoe UI Emoji" w:hAnsi="Segoe UI Emoji" w:cs="Segoe UI Emoji"/>
-          <w:b/>
-          <w:bCs/>
-        </w:rPr>
-      </w:pPr>
+        <w:t>🔹 Feature 1</w:t>
+      </w:r>
+      <w:r>
+        <w:rPr>
+          <w:rFonts w:ascii="Segoe UI Emoji" w:hAnsi="Segoe UI Emoji" w:cs="Segoe UI Emoji"/>
+          <w:b/>
+          <w:bCs/>
+        </w:rPr>
+        <w:t>5</w:t>
+      </w:r>
+      <w:r>
+        <w:rPr>
+          <w:rFonts w:ascii="Segoe UI Emoji" w:hAnsi="Segoe UI Emoji" w:cs="Segoe UI Emoji"/>
+          <w:b/>
+          <w:bCs/>
+        </w:rPr>
+        <w:t>.3 — Data Privacy &amp; Compliance</w:t>
+      </w:r>
+    </w:p>
+    <w:p>
+      <w:pPr>
+        <w:spacing w:after="0"/>
+        <w:rPr>
+          <w:rFonts w:ascii="Segoe UI Emoji" w:hAnsi="Segoe UI Emoji" w:cs="Segoe UI Emoji"/>
+          <w:b/>
+          <w:bCs/>
+        </w:rPr>
+      </w:pPr>
+      <w:r>
+        <w:rPr>
+          <w:rFonts w:ascii="Segoe UI Emoji" w:hAnsi="Segoe UI Emoji" w:cs="Segoe UI Emoji"/>
+          <w:b/>
+          <w:bCs/>
+        </w:rPr>
+        <w:t>Task 1</w:t>
+      </w:r>
+      <w:r>
+        <w:rPr>
+          <w:rFonts w:ascii="Segoe UI Emoji" w:hAnsi="Segoe UI Emoji" w:cs="Segoe UI Emoji"/>
+          <w:b/>
+          <w:bCs/>
+        </w:rPr>
+        <w:t>5</w:t>
+      </w:r>
+      <w:r>
+        <w:rPr>
+          <w:rFonts w:ascii="Segoe UI Emoji" w:hAnsi="Segoe UI Emoji" w:cs="Segoe UI Emoji"/>
+          <w:b/>
+          <w:bCs/>
+        </w:rPr>
+        <w:t>.3.1 — Compliance Layer</w:t>
+      </w:r>
+      <w:r>
+        <w:rPr>
+          <w:rFonts w:ascii="Segoe UI Emoji" w:hAnsi="Segoe UI Emoji" w:cs="Segoe UI Emoji"/>
+          <w:b/>
+          <w:bCs/>
+        </w:rPr>
+        <w:br/>
+        <w:t>• Step 1</w:t>
+      </w:r>
+      <w:r>
+        <w:rPr>
+          <w:rFonts w:ascii="Segoe UI Emoji" w:hAnsi="Segoe UI Emoji" w:cs="Segoe UI Emoji"/>
+          <w:b/>
+          <w:bCs/>
+        </w:rPr>
+        <w:t>5</w:t>
+      </w:r>
+      <w:r>
+        <w:rPr>
+          <w:rFonts w:ascii="Segoe UI Emoji" w:hAnsi="Segoe UI Emoji" w:cs="Segoe UI Emoji"/>
+          <w:b/>
+          <w:bCs/>
+        </w:rPr>
+        <w:t>.3.1.1 — GDPR readiness</w:t>
+      </w:r>
+      <w:r>
+        <w:rPr>
+          <w:rFonts w:ascii="Segoe UI Emoji" w:hAnsi="Segoe UI Emoji" w:cs="Segoe UI Emoji"/>
+          <w:b/>
+          <w:bCs/>
+        </w:rPr>
+        <w:br/>
+        <w:t>• Step 1</w:t>
+      </w:r>
+      <w:r>
+        <w:rPr>
+          <w:rFonts w:ascii="Segoe UI Emoji" w:hAnsi="Segoe UI Emoji" w:cs="Segoe UI Emoji"/>
+          <w:b/>
+          <w:bCs/>
+        </w:rPr>
+        <w:t>5</w:t>
+      </w:r>
+      <w:r>
+        <w:rPr>
+          <w:rFonts w:ascii="Segoe UI Emoji" w:hAnsi="Segoe UI Emoji" w:cs="Segoe UI Emoji"/>
+          <w:b/>
+          <w:bCs/>
+        </w:rPr>
+        <w:t>.3.1.2 — Data anonymization</w:t>
+      </w:r>
+      <w:r>
+        <w:rPr>
+          <w:rFonts w:ascii="Segoe UI Emoji" w:hAnsi="Segoe UI Emoji" w:cs="Segoe UI Emoji"/>
+          <w:b/>
+          <w:bCs/>
+        </w:rPr>
+        <w:br/>
+        <w:t>• Step 1</w:t>
+      </w:r>
+      <w:r>
+        <w:rPr>
+          <w:rFonts w:ascii="Segoe UI Emoji" w:hAnsi="Segoe UI Emoji" w:cs="Segoe UI Emoji"/>
+          <w:b/>
+          <w:bCs/>
+        </w:rPr>
+        <w:t>5</w:t>
+      </w:r>
+      <w:r>
+        <w:rPr>
+          <w:rFonts w:ascii="Segoe UI Emoji" w:hAnsi="Segoe UI Emoji" w:cs="Segoe UI Emoji"/>
+          <w:b/>
+          <w:bCs/>
+        </w:rPr>
+        <w:t>.3.1.3 — Consent management</w:t>
+      </w:r>
+    </w:p>
+    <w:p>
+      <w:pPr>
+        <w:spacing w:after="0"/>
+        <w:rPr>
+          <w:rFonts w:ascii="Segoe UI Emoji" w:hAnsi="Segoe UI Emoji" w:cs="Segoe UI Emoji"/>
+          <w:b/>
+          <w:bCs/>
+        </w:rPr>
+      </w:pPr>
+      <w:r>
+        <w:rPr>
+          <w:rFonts w:ascii="Segoe UI Emoji" w:hAnsi="Segoe UI Emoji" w:cs="Segoe UI Emoji"/>
+          <w:b/>
+          <w:bCs/>
+        </w:rPr>
+        <w:pict w14:anchorId="0FF1CFE4">
+          <v:rect id="_x0000_i1373" style="width:0;height:1.5pt" o:hralign="center" o:hrstd="t" o:hr="t" fillcolor="#a0a0a0" stroked="f"/>
+        </w:pict>
+      </w:r>
+    </w:p>
+    <w:p>
+      <w:pPr>
+        <w:spacing w:after="0"/>
+        <w:rPr>
+          <w:rFonts w:ascii="Segoe UI Emoji" w:hAnsi="Segoe UI Emoji" w:cs="Segoe UI Emoji"/>
+          <w:b/>
+          <w:bCs/>
+        </w:rPr>
+      </w:pPr>
+      <w:r>
+        <w:rPr>
+          <w:rFonts w:ascii="Segoe UI Emoji" w:hAnsi="Segoe UI Emoji" w:cs="Segoe UI Emoji"/>
+          <w:b/>
+          <w:bCs/>
+        </w:rPr>
+        <w:t>🔍 PHASE 1</w:t>
+      </w:r>
+      <w:r>
+        <w:rPr>
+          <w:rFonts w:ascii="Segoe UI Emoji" w:hAnsi="Segoe UI Emoji" w:cs="Segoe UI Emoji"/>
+          <w:b/>
+          <w:bCs/>
+        </w:rPr>
+        <w:t>4</w:t>
+      </w:r>
+      <w:r>
+        <w:rPr>
+          <w:rFonts w:ascii="Segoe UI Emoji" w:hAnsi="Segoe UI Emoji" w:cs="Segoe UI Emoji"/>
+          <w:b/>
+          <w:bCs/>
+        </w:rPr>
+        <w:t xml:space="preserve"> — ORGANIC SCALE (SEO + CONTENT MACHINE)</w:t>
+      </w:r>
+    </w:p>
+    <w:p>
+      <w:pPr>
+        <w:spacing w:after="0"/>
+        <w:rPr>
+          <w:rFonts w:ascii="Segoe UI Emoji" w:hAnsi="Segoe UI Emoji" w:cs="Segoe UI Emoji"/>
+          <w:b/>
+          <w:bCs/>
+        </w:rPr>
+      </w:pPr>
+      <w:r>
+        <w:rPr>
+          <w:rFonts w:ascii="Segoe UI Emoji" w:hAnsi="Segoe UI Emoji" w:cs="Segoe UI Emoji"/>
+          <w:b/>
+          <w:bCs/>
+        </w:rPr>
+        <w:pict w14:anchorId="4AC10670">
+          <v:rect id="_x0000_i1374" style="width:0;height:1.5pt" o:hralign="center" o:hrstd="t" o:hr="t" fillcolor="#a0a0a0" stroked="f"/>
+        </w:pict>
+      </w:r>
+    </w:p>
+    <w:p>
+      <w:pPr>
+        <w:spacing w:after="0"/>
+        <w:rPr>
+          <w:rFonts w:ascii="Segoe UI Emoji" w:hAnsi="Segoe UI Emoji" w:cs="Segoe UI Emoji"/>
+          <w:b/>
+          <w:bCs/>
+        </w:rPr>
+      </w:pPr>
+      <w:r>
+        <w:rPr>
+          <w:rFonts w:ascii="Segoe UI Emoji" w:hAnsi="Segoe UI Emoji" w:cs="Segoe UI Emoji"/>
+          <w:b/>
+          <w:bCs/>
+        </w:rPr>
+        <w:t>🔹 Feature 1</w:t>
+      </w:r>
+      <w:r>
+        <w:rPr>
+          <w:rFonts w:ascii="Segoe UI Emoji" w:hAnsi="Segoe UI Emoji" w:cs="Segoe UI Emoji"/>
+          <w:b/>
+          <w:bCs/>
+        </w:rPr>
+        <w:t>4</w:t>
+      </w:r>
+      <w:r>
+        <w:rPr>
+          <w:rFonts w:ascii="Segoe UI Emoji" w:hAnsi="Segoe UI Emoji" w:cs="Segoe UI Emoji"/>
+          <w:b/>
+          <w:bCs/>
+        </w:rPr>
+        <w:t>.1 — Programmatic SEO</w:t>
+      </w:r>
+    </w:p>
+    <w:p>
+      <w:pPr>
+        <w:spacing w:after="0"/>
+        <w:rPr>
+          <w:rFonts w:ascii="Segoe UI Emoji" w:hAnsi="Segoe UI Emoji" w:cs="Segoe UI Emoji"/>
+          <w:b/>
+          <w:bCs/>
+        </w:rPr>
+      </w:pPr>
+      <w:r>
+        <w:rPr>
+          <w:rFonts w:ascii="Segoe UI Emoji" w:hAnsi="Segoe UI Emoji" w:cs="Segoe UI Emoji"/>
+          <w:b/>
+          <w:bCs/>
+        </w:rPr>
+        <w:t>Task 1</w:t>
+      </w:r>
+      <w:r>
+        <w:rPr>
+          <w:rFonts w:ascii="Segoe UI Emoji" w:hAnsi="Segoe UI Emoji" w:cs="Segoe UI Emoji"/>
+          <w:b/>
+          <w:bCs/>
+        </w:rPr>
+        <w:t>4</w:t>
+      </w:r>
+      <w:r>
+        <w:rPr>
+          <w:rFonts w:ascii="Segoe UI Emoji" w:hAnsi="Segoe UI Emoji" w:cs="Segoe UI Emoji"/>
+          <w:b/>
+          <w:bCs/>
+        </w:rPr>
+        <w:t>.1.1 — Dynamic Page Generation</w:t>
+      </w:r>
+      <w:r>
+        <w:rPr>
+          <w:rFonts w:ascii="Segoe UI Emoji" w:hAnsi="Segoe UI Emoji" w:cs="Segoe UI Emoji"/>
+          <w:b/>
+          <w:bCs/>
+        </w:rPr>
+        <w:br/>
+        <w:t>• Step 1</w:t>
+      </w:r>
+      <w:r>
+        <w:rPr>
+          <w:rFonts w:ascii="Segoe UI Emoji" w:hAnsi="Segoe UI Emoji" w:cs="Segoe UI Emoji"/>
+          <w:b/>
+          <w:bCs/>
+        </w:rPr>
+        <w:t>4</w:t>
+      </w:r>
+      <w:r>
+        <w:rPr>
+          <w:rFonts w:ascii="Segoe UI Emoji" w:hAnsi="Segoe UI Emoji" w:cs="Segoe UI Emoji"/>
+          <w:b/>
+          <w:bCs/>
+        </w:rPr>
+        <w:t>.1.1.1 — Generate pages for user profiles</w:t>
+      </w:r>
+      <w:r>
+        <w:rPr>
+          <w:rFonts w:ascii="Segoe UI Emoji" w:hAnsi="Segoe UI Emoji" w:cs="Segoe UI Emoji"/>
+          <w:b/>
+          <w:bCs/>
+        </w:rPr>
+        <w:br/>
+        <w:t>• Step 1</w:t>
+      </w:r>
+      <w:r>
+        <w:rPr>
+          <w:rFonts w:ascii="Segoe UI Emoji" w:hAnsi="Segoe UI Emoji" w:cs="Segoe UI Emoji"/>
+          <w:b/>
+          <w:bCs/>
+        </w:rPr>
+        <w:t>4</w:t>
+      </w:r>
+      <w:r>
+        <w:rPr>
+          <w:rFonts w:ascii="Segoe UI Emoji" w:hAnsi="Segoe UI Emoji" w:cs="Segoe UI Emoji"/>
+          <w:b/>
+          <w:bCs/>
+        </w:rPr>
+        <w:t>.1.1.2 — Optimize metadata</w:t>
+      </w:r>
+      <w:r>
+        <w:rPr>
+          <w:rFonts w:ascii="Segoe UI Emoji" w:hAnsi="Segoe UI Emoji" w:cs="Segoe UI Emoji"/>
+          <w:b/>
+          <w:bCs/>
+        </w:rPr>
+        <w:br/>
+        <w:t>• Step 1</w:t>
+      </w:r>
+      <w:r>
+        <w:rPr>
+          <w:rFonts w:ascii="Segoe UI Emoji" w:hAnsi="Segoe UI Emoji" w:cs="Segoe UI Emoji"/>
+          <w:b/>
+          <w:bCs/>
+        </w:rPr>
+        <w:t>4</w:t>
+      </w:r>
+      <w:r>
+        <w:rPr>
+          <w:rFonts w:ascii="Segoe UI Emoji" w:hAnsi="Segoe UI Emoji" w:cs="Segoe UI Emoji"/>
+          <w:b/>
+          <w:bCs/>
+        </w:rPr>
+        <w:t>.1.1.3 — Internal linking strategy</w:t>
+      </w:r>
+    </w:p>
+    <w:p>
+      <w:pPr>
+        <w:spacing w:after="0"/>
+        <w:rPr>
+          <w:rFonts w:ascii="Segoe UI Emoji" w:hAnsi="Segoe UI Emoji" w:cs="Segoe UI Emoji"/>
+          <w:b/>
+          <w:bCs/>
+        </w:rPr>
+      </w:pPr>
+      <w:r>
+        <w:rPr>
+          <w:rFonts w:ascii="Segoe UI Emoji" w:hAnsi="Segoe UI Emoji" w:cs="Segoe UI Emoji"/>
+          <w:b/>
+          <w:bCs/>
+        </w:rPr>
+        <w:pict w14:anchorId="6A20E1C2">
+          <v:rect id="_x0000_i1375" style="width:0;height:1.5pt" o:hralign="center" o:hrstd="t" o:hr="t" fillcolor="#a0a0a0" stroked="f"/>
+        </w:pict>
+      </w:r>
+    </w:p>
+    <w:p>
+      <w:pPr>
+        <w:spacing w:after="0"/>
+        <w:rPr>
+          <w:rFonts w:ascii="Segoe UI Emoji" w:hAnsi="Segoe UI Emoji" w:cs="Segoe UI Emoji"/>
+          <w:b/>
+          <w:bCs/>
+        </w:rPr>
+      </w:pPr>
+      <w:r>
+        <w:rPr>
+          <w:rFonts w:ascii="Segoe UI Emoji" w:hAnsi="Segoe UI Emoji" w:cs="Segoe UI Emoji"/>
+          <w:b/>
+          <w:bCs/>
+        </w:rPr>
+        <w:t>🔹 Feature 1</w:t>
+      </w:r>
+      <w:r>
+        <w:rPr>
+          <w:rFonts w:ascii="Segoe UI Emoji" w:hAnsi="Segoe UI Emoji" w:cs="Segoe UI Emoji"/>
+          <w:b/>
+          <w:bCs/>
+        </w:rPr>
+        <w:t>4</w:t>
+      </w:r>
+      <w:r>
+        <w:rPr>
+          <w:rFonts w:ascii="Segoe UI Emoji" w:hAnsi="Segoe UI Emoji" w:cs="Segoe UI Emoji"/>
+          <w:b/>
+          <w:bCs/>
+        </w:rPr>
+        <w:t>.2 — Content Engine</w:t>
+      </w:r>
+    </w:p>
+    <w:p>
+      <w:pPr>
+        <w:spacing w:after="0"/>
+        <w:rPr>
+          <w:rFonts w:ascii="Segoe UI Emoji" w:hAnsi="Segoe UI Emoji" w:cs="Segoe UI Emoji"/>
+          <w:b/>
+          <w:bCs/>
+        </w:rPr>
+      </w:pPr>
+      <w:r>
+        <w:rPr>
+          <w:rFonts w:ascii="Segoe UI Emoji" w:hAnsi="Segoe UI Emoji" w:cs="Segoe UI Emoji"/>
+          <w:b/>
+          <w:bCs/>
+        </w:rPr>
+        <w:t>Task 1</w:t>
+      </w:r>
+      <w:r>
+        <w:rPr>
+          <w:rFonts w:ascii="Segoe UI Emoji" w:hAnsi="Segoe UI Emoji" w:cs="Segoe UI Emoji"/>
+          <w:b/>
+          <w:bCs/>
+        </w:rPr>
+        <w:t>4</w:t>
+      </w:r>
+      <w:r>
+        <w:rPr>
+          <w:rFonts w:ascii="Segoe UI Emoji" w:hAnsi="Segoe UI Emoji" w:cs="Segoe UI Emoji"/>
+          <w:b/>
+          <w:bCs/>
+        </w:rPr>
+        <w:t>.2.1 — Blog &amp; Content</w:t>
+      </w:r>
+      <w:r>
+        <w:rPr>
+          <w:rFonts w:ascii="Segoe UI Emoji" w:hAnsi="Segoe UI Emoji" w:cs="Segoe UI Emoji"/>
+          <w:b/>
+          <w:bCs/>
+        </w:rPr>
+        <w:br/>
+        <w:t>• Step 1</w:t>
+      </w:r>
+      <w:r>
+        <w:rPr>
+          <w:rFonts w:ascii="Segoe UI Emoji" w:hAnsi="Segoe UI Emoji" w:cs="Segoe UI Emoji"/>
+          <w:b/>
+          <w:bCs/>
+        </w:rPr>
+        <w:t>4</w:t>
+      </w:r>
+      <w:r>
+        <w:rPr>
+          <w:rFonts w:ascii="Segoe UI Emoji" w:hAnsi="Segoe UI Emoji" w:cs="Segoe UI Emoji"/>
+          <w:b/>
+          <w:bCs/>
+        </w:rPr>
+        <w:t>.2.1.1 — Publish weekly case studies</w:t>
+      </w:r>
+      <w:r>
+        <w:rPr>
+          <w:rFonts w:ascii="Segoe UI Emoji" w:hAnsi="Segoe UI Emoji" w:cs="Segoe UI Emoji"/>
+          <w:b/>
+          <w:bCs/>
+        </w:rPr>
+        <w:br/>
+        <w:t>• Step 1</w:t>
+      </w:r>
+      <w:r>
+        <w:rPr>
+          <w:rFonts w:ascii="Segoe UI Emoji" w:hAnsi="Segoe UI Emoji" w:cs="Segoe UI Emoji"/>
+          <w:b/>
+          <w:bCs/>
+        </w:rPr>
+        <w:t>4</w:t>
+      </w:r>
+      <w:r>
+        <w:rPr>
+          <w:rFonts w:ascii="Segoe UI Emoji" w:hAnsi="Segoe UI Emoji" w:cs="Segoe UI Emoji"/>
+          <w:b/>
+          <w:bCs/>
+        </w:rPr>
+        <w:t>.2.1.2 — Publish data-driven insights</w:t>
+      </w:r>
+      <w:r>
+        <w:rPr>
+          <w:rFonts w:ascii="Segoe UI Emoji" w:hAnsi="Segoe UI Emoji" w:cs="Segoe UI Emoji"/>
+          <w:b/>
+          <w:bCs/>
+        </w:rPr>
+        <w:br/>
+        <w:t>• Step 1</w:t>
+      </w:r>
+      <w:r>
+        <w:rPr>
+          <w:rFonts w:ascii="Segoe UI Emoji" w:hAnsi="Segoe UI Emoji" w:cs="Segoe UI Emoji"/>
+          <w:b/>
+          <w:bCs/>
+        </w:rPr>
+        <w:t>4</w:t>
+      </w:r>
+      <w:r>
+        <w:rPr>
+          <w:rFonts w:ascii="Segoe UI Emoji" w:hAnsi="Segoe UI Emoji" w:cs="Segoe UI Emoji"/>
+          <w:b/>
+          <w:bCs/>
+        </w:rPr>
+        <w:t>.2.1.3 — Target long-tail keywords</w:t>
+      </w:r>
+    </w:p>
+    <w:p>
+      <w:pPr>
+        <w:spacing w:after="0"/>
+        <w:rPr>
+          <w:rFonts w:ascii="Segoe UI Emoji" w:hAnsi="Segoe UI Emoji" w:cs="Segoe UI Emoji"/>
+          <w:b/>
+          <w:bCs/>
+        </w:rPr>
+      </w:pPr>
+      <w:r>
+        <w:rPr>
+          <w:rFonts w:ascii="Segoe UI Emoji" w:hAnsi="Segoe UI Emoji" w:cs="Segoe UI Emoji"/>
+          <w:b/>
+          <w:bCs/>
+        </w:rPr>
+        <w:pict w14:anchorId="0A81BEF9">
+          <v:rect id="_x0000_i1376" style="width:0;height:1.5pt" o:hralign="center" o:hrstd="t" o:hr="t" fillcolor="#a0a0a0" stroked="f"/>
+        </w:pict>
+      </w:r>
+    </w:p>
+    <w:p>
+      <w:pPr>
+        <w:spacing w:after="0"/>
+        <w:rPr>
+          <w:rFonts w:ascii="Segoe UI Emoji" w:hAnsi="Segoe UI Emoji" w:cs="Segoe UI Emoji"/>
+          <w:b/>
+          <w:bCs/>
+        </w:rPr>
+      </w:pPr>
+      <w:r>
+        <w:rPr>
+          <w:rFonts w:ascii="Segoe UI Emoji" w:hAnsi="Segoe UI Emoji" w:cs="Segoe UI Emoji"/>
+          <w:b/>
+          <w:bCs/>
+        </w:rPr>
+        <w:t>🔹 Feature 1</w:t>
+      </w:r>
+      <w:r>
+        <w:rPr>
+          <w:rFonts w:ascii="Segoe UI Emoji" w:hAnsi="Segoe UI Emoji" w:cs="Segoe UI Emoji"/>
+          <w:b/>
+          <w:bCs/>
+        </w:rPr>
+        <w:t>4</w:t>
+      </w:r>
+      <w:r>
+        <w:rPr>
+          <w:rFonts w:ascii="Segoe UI Emoji" w:hAnsi="Segoe UI Emoji" w:cs="Segoe UI Emoji"/>
+          <w:b/>
+          <w:bCs/>
+        </w:rPr>
+        <w:t>.3 — Growth Flywheel</w:t>
+      </w:r>
+    </w:p>
+    <w:p>
+      <w:pPr>
+        <w:spacing w:after="0"/>
+        <w:rPr>
+          <w:rFonts w:ascii="Segoe UI Emoji" w:hAnsi="Segoe UI Emoji" w:cs="Segoe UI Emoji"/>
+          <w:b/>
+          <w:bCs/>
+        </w:rPr>
+      </w:pPr>
+      <w:r>
+        <w:rPr>
+          <w:rFonts w:ascii="Segoe UI Emoji" w:hAnsi="Segoe UI Emoji" w:cs="Segoe UI Emoji"/>
+          <w:b/>
+          <w:bCs/>
+        </w:rPr>
+        <w:t>Task 1</w:t>
+      </w:r>
+      <w:r>
+        <w:rPr>
+          <w:rFonts w:ascii="Segoe UI Emoji" w:hAnsi="Segoe UI Emoji" w:cs="Segoe UI Emoji"/>
+          <w:b/>
+          <w:bCs/>
+        </w:rPr>
+        <w:t>4</w:t>
+      </w:r>
+      <w:r>
+        <w:rPr>
+          <w:rFonts w:ascii="Segoe UI Emoji" w:hAnsi="Segoe UI Emoji" w:cs="Segoe UI Emoji"/>
+          <w:b/>
+          <w:bCs/>
+        </w:rPr>
+        <w:t>.3.1 — User-Generated SEO</w:t>
+      </w:r>
+      <w:r>
+        <w:rPr>
+          <w:rFonts w:ascii="Segoe UI Emoji" w:hAnsi="Segoe UI Emoji" w:cs="Segoe UI Emoji"/>
+          <w:b/>
+          <w:bCs/>
+        </w:rPr>
+        <w:br/>
+        <w:t>• Step 1</w:t>
+      </w:r>
+      <w:r>
+        <w:rPr>
+          <w:rFonts w:ascii="Segoe UI Emoji" w:hAnsi="Segoe UI Emoji" w:cs="Segoe UI Emoji"/>
+          <w:b/>
+          <w:bCs/>
+        </w:rPr>
+        <w:t>4</w:t>
+      </w:r>
+      <w:r>
+        <w:rPr>
+          <w:rFonts w:ascii="Segoe UI Emoji" w:hAnsi="Segoe UI Emoji" w:cs="Segoe UI Emoji"/>
+          <w:b/>
+          <w:bCs/>
+        </w:rPr>
+        <w:t>.3.1.1 — Index user-generated plans</w:t>
+      </w:r>
+      <w:r>
+        <w:rPr>
+          <w:rFonts w:ascii="Segoe UI Emoji" w:hAnsi="Segoe UI Emoji" w:cs="Segoe UI Emoji"/>
+          <w:b/>
+          <w:bCs/>
+        </w:rPr>
+        <w:br/>
+      </w:r>
       <w:r>
         <w:rPr>
           <w:rFonts w:ascii="Segoe UI Emoji" w:hAnsi="Segoe UI Emoji" w:cs="Segoe UI Emoji"/>
@@ -6398,7 +8224,23 @@
           <w:bCs/>
         </w:rPr>
         <w:lastRenderedPageBreak/>
-        <w:t>• Step 12.3.1.1 — GDPR readiness</w:t>
+        <w:t>• Step 1</w:t>
+      </w:r>
+      <w:r>
+        <w:rPr>
+          <w:rFonts w:ascii="Segoe UI Emoji" w:hAnsi="Segoe UI Emoji" w:cs="Segoe UI Emoji"/>
+          <w:b/>
+          <w:bCs/>
+        </w:rPr>
+        <w:t>4</w:t>
+      </w:r>
+      <w:r>
+        <w:rPr>
+          <w:rFonts w:ascii="Segoe UI Emoji" w:hAnsi="Segoe UI Emoji" w:cs="Segoe UI Emoji"/>
+          <w:b/>
+          <w:bCs/>
+        </w:rPr>
+        <w:t>.3.1.2 — Enable sharing + backlinks</w:t>
       </w:r>
       <w:r>
         <w:rPr>
@@ -6407,16 +8249,23 @@
           <w:bCs/>
         </w:rPr>
         <w:br/>
-        <w:t>• Step 12.3.1.2 — Data anonymization</w:t>
-      </w:r>
-      <w:r>
-        <w:rPr>
-          <w:rFonts w:ascii="Segoe UI Emoji" w:hAnsi="Segoe UI Emoji" w:cs="Segoe UI Emoji"/>
-          <w:b/>
-          <w:bCs/>
-        </w:rPr>
-        <w:br/>
-        <w:t>• Step 12.3.1.3 — Consent management</w:t>
+        <w:t>• Step 1</w:t>
+      </w:r>
+      <w:r>
+        <w:rPr>
+          <w:rFonts w:ascii="Segoe UI Emoji" w:hAnsi="Segoe UI Emoji" w:cs="Segoe UI Emoji"/>
+          <w:b/>
+          <w:bCs/>
+        </w:rPr>
+        <w:t>4</w:t>
+      </w:r>
+      <w:r>
+        <w:rPr>
+          <w:rFonts w:ascii="Segoe UI Emoji" w:hAnsi="Segoe UI Emoji" w:cs="Segoe UI Emoji"/>
+          <w:b/>
+          <w:bCs/>
+        </w:rPr>
+        <w:t>.3.1.3 — Optimize indexing performance</w:t>
       </w:r>
     </w:p>
     <w:p>
@@ -7480,6 +9329,155 @@
     </w:lvl>
   </w:abstractNum>
   <w:abstractNum w:abstractNumId="7" w15:restartNumberingAfterBreak="0">
+    <w:nsid w:val="098D2725"/>
+    <w:multiLevelType w:val="multilevel"/>
+    <w:tmpl w:val="FF808E64"/>
+    <w:lvl w:ilvl="0">
+      <w:start w:val="1"/>
+      <w:numFmt w:val="bullet"/>
+      <w:lvlText w:val=""/>
+      <w:lvlJc w:val="left"/>
+      <w:pPr>
+        <w:tabs>
+          <w:tab w:val="num" w:pos="720"/>
+        </w:tabs>
+        <w:ind w:left="720" w:hanging="360"/>
+      </w:pPr>
+      <w:rPr>
+        <w:rFonts w:ascii="Symbol" w:hAnsi="Symbol" w:hint="default"/>
+        <w:sz w:val="20"/>
+      </w:rPr>
+    </w:lvl>
+    <w:lvl w:ilvl="1" w:tentative="1">
+      <w:start w:val="1"/>
+      <w:numFmt w:val="bullet"/>
+      <w:lvlText w:val="o"/>
+      <w:lvlJc w:val="left"/>
+      <w:pPr>
+        <w:tabs>
+          <w:tab w:val="num" w:pos="1440"/>
+        </w:tabs>
+        <w:ind w:left="1440" w:hanging="360"/>
+      </w:pPr>
+      <w:rPr>
+        <w:rFonts w:ascii="Courier New" w:hAnsi="Courier New" w:hint="default"/>
+        <w:sz w:val="20"/>
+      </w:rPr>
+    </w:lvl>
+    <w:lvl w:ilvl="2" w:tentative="1">
+      <w:start w:val="1"/>
+      <w:numFmt w:val="bullet"/>
+      <w:lvlText w:val=""/>
+      <w:lvlJc w:val="left"/>
+      <w:pPr>
+        <w:tabs>
+          <w:tab w:val="num" w:pos="2160"/>
+        </w:tabs>
+        <w:ind w:left="2160" w:hanging="360"/>
+      </w:pPr>
+      <w:rPr>
+        <w:rFonts w:ascii="Wingdings" w:hAnsi="Wingdings" w:hint="default"/>
+        <w:sz w:val="20"/>
+      </w:rPr>
+    </w:lvl>
+    <w:lvl w:ilvl="3" w:tentative="1">
+      <w:start w:val="1"/>
+      <w:numFmt w:val="bullet"/>
+      <w:lvlText w:val=""/>
+      <w:lvlJc w:val="left"/>
+      <w:pPr>
+        <w:tabs>
+          <w:tab w:val="num" w:pos="2880"/>
+        </w:tabs>
+        <w:ind w:left="2880" w:hanging="360"/>
+      </w:pPr>
+      <w:rPr>
+        <w:rFonts w:ascii="Wingdings" w:hAnsi="Wingdings" w:hint="default"/>
+        <w:sz w:val="20"/>
+      </w:rPr>
+    </w:lvl>
+    <w:lvl w:ilvl="4" w:tentative="1">
+      <w:start w:val="1"/>
+      <w:numFmt w:val="bullet"/>
+      <w:lvlText w:val=""/>
+      <w:lvlJc w:val="left"/>
+      <w:pPr>
+        <w:tabs>
+          <w:tab w:val="num" w:pos="3600"/>
+        </w:tabs>
+        <w:ind w:left="3600" w:hanging="360"/>
+      </w:pPr>
+      <w:rPr>
+        <w:rFonts w:ascii="Wingdings" w:hAnsi="Wingdings" w:hint="default"/>
+        <w:sz w:val="20"/>
+      </w:rPr>
+    </w:lvl>
+    <w:lvl w:ilvl="5" w:tentative="1">
+      <w:start w:val="1"/>
+      <w:numFmt w:val="bullet"/>
+      <w:lvlText w:val=""/>
+      <w:lvlJc w:val="left"/>
+      <w:pPr>
+        <w:tabs>
+          <w:tab w:val="num" w:pos="4320"/>
+        </w:tabs>
+        <w:ind w:left="4320" w:hanging="360"/>
+      </w:pPr>
+      <w:rPr>
+        <w:rFonts w:ascii="Wingdings" w:hAnsi="Wingdings" w:hint="default"/>
+        <w:sz w:val="20"/>
+      </w:rPr>
+    </w:lvl>
+    <w:lvl w:ilvl="6" w:tentative="1">
+      <w:start w:val="1"/>
+      <w:numFmt w:val="bullet"/>
+      <w:lvlText w:val=""/>
+      <w:lvlJc w:val="left"/>
+      <w:pPr>
+        <w:tabs>
+          <w:tab w:val="num" w:pos="5040"/>
+        </w:tabs>
+        <w:ind w:left="5040" w:hanging="360"/>
+      </w:pPr>
+      <w:rPr>
+        <w:rFonts w:ascii="Wingdings" w:hAnsi="Wingdings" w:hint="default"/>
+        <w:sz w:val="20"/>
+      </w:rPr>
+    </w:lvl>
+    <w:lvl w:ilvl="7" w:tentative="1">
+      <w:start w:val="1"/>
+      <w:numFmt w:val="bullet"/>
+      <w:lvlText w:val=""/>
+      <w:lvlJc w:val="left"/>
+      <w:pPr>
+        <w:tabs>
+          <w:tab w:val="num" w:pos="5760"/>
+        </w:tabs>
+        <w:ind w:left="5760" w:hanging="360"/>
+      </w:pPr>
+      <w:rPr>
+        <w:rFonts w:ascii="Wingdings" w:hAnsi="Wingdings" w:hint="default"/>
+        <w:sz w:val="20"/>
+      </w:rPr>
+    </w:lvl>
+    <w:lvl w:ilvl="8" w:tentative="1">
+      <w:start w:val="1"/>
+      <w:numFmt w:val="bullet"/>
+      <w:lvlText w:val=""/>
+      <w:lvlJc w:val="left"/>
+      <w:pPr>
+        <w:tabs>
+          <w:tab w:val="num" w:pos="6480"/>
+        </w:tabs>
+        <w:ind w:left="6480" w:hanging="360"/>
+      </w:pPr>
+      <w:rPr>
+        <w:rFonts w:ascii="Wingdings" w:hAnsi="Wingdings" w:hint="default"/>
+        <w:sz w:val="20"/>
+      </w:rPr>
+    </w:lvl>
+  </w:abstractNum>
+  <w:abstractNum w:abstractNumId="8" w15:restartNumberingAfterBreak="0">
     <w:nsid w:val="09E24D09"/>
     <w:multiLevelType w:val="multilevel"/>
     <w:tmpl w:val="50E60D16"/>
@@ -7628,7 +9626,156 @@
       </w:rPr>
     </w:lvl>
   </w:abstractNum>
-  <w:abstractNum w:abstractNumId="8" w15:restartNumberingAfterBreak="0">
+  <w:abstractNum w:abstractNumId="9" w15:restartNumberingAfterBreak="0">
+    <w:nsid w:val="0A5926A0"/>
+    <w:multiLevelType w:val="multilevel"/>
+    <w:tmpl w:val="F5543E9E"/>
+    <w:lvl w:ilvl="0">
+      <w:start w:val="1"/>
+      <w:numFmt w:val="bullet"/>
+      <w:lvlText w:val=""/>
+      <w:lvlJc w:val="left"/>
+      <w:pPr>
+        <w:tabs>
+          <w:tab w:val="num" w:pos="720"/>
+        </w:tabs>
+        <w:ind w:left="720" w:hanging="360"/>
+      </w:pPr>
+      <w:rPr>
+        <w:rFonts w:ascii="Symbol" w:hAnsi="Symbol" w:hint="default"/>
+        <w:sz w:val="20"/>
+      </w:rPr>
+    </w:lvl>
+    <w:lvl w:ilvl="1" w:tentative="1">
+      <w:start w:val="1"/>
+      <w:numFmt w:val="bullet"/>
+      <w:lvlText w:val="o"/>
+      <w:lvlJc w:val="left"/>
+      <w:pPr>
+        <w:tabs>
+          <w:tab w:val="num" w:pos="1440"/>
+        </w:tabs>
+        <w:ind w:left="1440" w:hanging="360"/>
+      </w:pPr>
+      <w:rPr>
+        <w:rFonts w:ascii="Courier New" w:hAnsi="Courier New" w:hint="default"/>
+        <w:sz w:val="20"/>
+      </w:rPr>
+    </w:lvl>
+    <w:lvl w:ilvl="2" w:tentative="1">
+      <w:start w:val="1"/>
+      <w:numFmt w:val="bullet"/>
+      <w:lvlText w:val=""/>
+      <w:lvlJc w:val="left"/>
+      <w:pPr>
+        <w:tabs>
+          <w:tab w:val="num" w:pos="2160"/>
+        </w:tabs>
+        <w:ind w:left="2160" w:hanging="360"/>
+      </w:pPr>
+      <w:rPr>
+        <w:rFonts w:ascii="Wingdings" w:hAnsi="Wingdings" w:hint="default"/>
+        <w:sz w:val="20"/>
+      </w:rPr>
+    </w:lvl>
+    <w:lvl w:ilvl="3" w:tentative="1">
+      <w:start w:val="1"/>
+      <w:numFmt w:val="bullet"/>
+      <w:lvlText w:val=""/>
+      <w:lvlJc w:val="left"/>
+      <w:pPr>
+        <w:tabs>
+          <w:tab w:val="num" w:pos="2880"/>
+        </w:tabs>
+        <w:ind w:left="2880" w:hanging="360"/>
+      </w:pPr>
+      <w:rPr>
+        <w:rFonts w:ascii="Wingdings" w:hAnsi="Wingdings" w:hint="default"/>
+        <w:sz w:val="20"/>
+      </w:rPr>
+    </w:lvl>
+    <w:lvl w:ilvl="4" w:tentative="1">
+      <w:start w:val="1"/>
+      <w:numFmt w:val="bullet"/>
+      <w:lvlText w:val=""/>
+      <w:lvlJc w:val="left"/>
+      <w:pPr>
+        <w:tabs>
+          <w:tab w:val="num" w:pos="3600"/>
+        </w:tabs>
+        <w:ind w:left="3600" w:hanging="360"/>
+      </w:pPr>
+      <w:rPr>
+        <w:rFonts w:ascii="Wingdings" w:hAnsi="Wingdings" w:hint="default"/>
+        <w:sz w:val="20"/>
+      </w:rPr>
+    </w:lvl>
+    <w:lvl w:ilvl="5" w:tentative="1">
+      <w:start w:val="1"/>
+      <w:numFmt w:val="bullet"/>
+      <w:lvlText w:val=""/>
+      <w:lvlJc w:val="left"/>
+      <w:pPr>
+        <w:tabs>
+          <w:tab w:val="num" w:pos="4320"/>
+        </w:tabs>
+        <w:ind w:left="4320" w:hanging="360"/>
+      </w:pPr>
+      <w:rPr>
+        <w:rFonts w:ascii="Wingdings" w:hAnsi="Wingdings" w:hint="default"/>
+        <w:sz w:val="20"/>
+      </w:rPr>
+    </w:lvl>
+    <w:lvl w:ilvl="6" w:tentative="1">
+      <w:start w:val="1"/>
+      <w:numFmt w:val="bullet"/>
+      <w:lvlText w:val=""/>
+      <w:lvlJc w:val="left"/>
+      <w:pPr>
+        <w:tabs>
+          <w:tab w:val="num" w:pos="5040"/>
+        </w:tabs>
+        <w:ind w:left="5040" w:hanging="360"/>
+      </w:pPr>
+      <w:rPr>
+        <w:rFonts w:ascii="Wingdings" w:hAnsi="Wingdings" w:hint="default"/>
+        <w:sz w:val="20"/>
+      </w:rPr>
+    </w:lvl>
+    <w:lvl w:ilvl="7" w:tentative="1">
+      <w:start w:val="1"/>
+      <w:numFmt w:val="bullet"/>
+      <w:lvlText w:val=""/>
+      <w:lvlJc w:val="left"/>
+      <w:pPr>
+        <w:tabs>
+          <w:tab w:val="num" w:pos="5760"/>
+        </w:tabs>
+        <w:ind w:left="5760" w:hanging="360"/>
+      </w:pPr>
+      <w:rPr>
+        <w:rFonts w:ascii="Wingdings" w:hAnsi="Wingdings" w:hint="default"/>
+        <w:sz w:val="20"/>
+      </w:rPr>
+    </w:lvl>
+    <w:lvl w:ilvl="8" w:tentative="1">
+      <w:start w:val="1"/>
+      <w:numFmt w:val="bullet"/>
+      <w:lvlText w:val=""/>
+      <w:lvlJc w:val="left"/>
+      <w:pPr>
+        <w:tabs>
+          <w:tab w:val="num" w:pos="6480"/>
+        </w:tabs>
+        <w:ind w:left="6480" w:hanging="360"/>
+      </w:pPr>
+      <w:rPr>
+        <w:rFonts w:ascii="Wingdings" w:hAnsi="Wingdings" w:hint="default"/>
+        <w:sz w:val="20"/>
+      </w:rPr>
+    </w:lvl>
+  </w:abstractNum>
+  <w:abstractNum w:abstractNumId="10" w15:restartNumberingAfterBreak="0">
     <w:nsid w:val="0C2A4D1F"/>
     <w:multiLevelType w:val="multilevel"/>
     <w:tmpl w:val="DC8A50BE"/>
@@ -7777,7 +9924,7 @@
       </w:rPr>
     </w:lvl>
   </w:abstractNum>
-  <w:abstractNum w:abstractNumId="9" w15:restartNumberingAfterBreak="0">
+  <w:abstractNum w:abstractNumId="11" w15:restartNumberingAfterBreak="0">
     <w:nsid w:val="0C820C46"/>
     <w:multiLevelType w:val="multilevel"/>
     <w:tmpl w:val="2EF02978"/>
@@ -7926,7 +10073,7 @@
       </w:rPr>
     </w:lvl>
   </w:abstractNum>
-  <w:abstractNum w:abstractNumId="10" w15:restartNumberingAfterBreak="0">
+  <w:abstractNum w:abstractNumId="12" w15:restartNumberingAfterBreak="0">
     <w:nsid w:val="0CA00DD4"/>
     <w:multiLevelType w:val="multilevel"/>
     <w:tmpl w:val="572E1414"/>
@@ -8075,7 +10222,7 @@
       </w:rPr>
     </w:lvl>
   </w:abstractNum>
-  <w:abstractNum w:abstractNumId="11" w15:restartNumberingAfterBreak="0">
+  <w:abstractNum w:abstractNumId="13" w15:restartNumberingAfterBreak="0">
     <w:nsid w:val="0CD45410"/>
     <w:multiLevelType w:val="multilevel"/>
     <w:tmpl w:val="65E6AB60"/>
@@ -8224,7 +10371,7 @@
       </w:rPr>
     </w:lvl>
   </w:abstractNum>
-  <w:abstractNum w:abstractNumId="12" w15:restartNumberingAfterBreak="0">
+  <w:abstractNum w:abstractNumId="14" w15:restartNumberingAfterBreak="0">
     <w:nsid w:val="0D2755A9"/>
     <w:multiLevelType w:val="multilevel"/>
     <w:tmpl w:val="E4B6C00E"/>
@@ -8373,7 +10520,7 @@
       </w:rPr>
     </w:lvl>
   </w:abstractNum>
-  <w:abstractNum w:abstractNumId="13" w15:restartNumberingAfterBreak="0">
+  <w:abstractNum w:abstractNumId="15" w15:restartNumberingAfterBreak="0">
     <w:nsid w:val="0D32617A"/>
     <w:multiLevelType w:val="multilevel"/>
     <w:tmpl w:val="7D8C05D8"/>
@@ -8522,7 +10669,7 @@
       </w:rPr>
     </w:lvl>
   </w:abstractNum>
-  <w:abstractNum w:abstractNumId="14" w15:restartNumberingAfterBreak="0">
+  <w:abstractNum w:abstractNumId="16" w15:restartNumberingAfterBreak="0">
     <w:nsid w:val="0DED6DE3"/>
     <w:multiLevelType w:val="multilevel"/>
     <w:tmpl w:val="BD9EE0F6"/>
@@ -8671,7 +10818,7 @@
       </w:rPr>
     </w:lvl>
   </w:abstractNum>
-  <w:abstractNum w:abstractNumId="15" w15:restartNumberingAfterBreak="0">
+  <w:abstractNum w:abstractNumId="17" w15:restartNumberingAfterBreak="0">
     <w:nsid w:val="10565ACD"/>
     <w:multiLevelType w:val="multilevel"/>
     <w:tmpl w:val="6D40C4D4"/>
@@ -8820,7 +10967,7 @@
       </w:rPr>
     </w:lvl>
   </w:abstractNum>
-  <w:abstractNum w:abstractNumId="16" w15:restartNumberingAfterBreak="0">
+  <w:abstractNum w:abstractNumId="18" w15:restartNumberingAfterBreak="0">
     <w:nsid w:val="10D743B3"/>
     <w:multiLevelType w:val="multilevel"/>
     <w:tmpl w:val="F7C8705E"/>
@@ -8969,7 +11116,7 @@
       </w:rPr>
     </w:lvl>
   </w:abstractNum>
-  <w:abstractNum w:abstractNumId="17" w15:restartNumberingAfterBreak="0">
+  <w:abstractNum w:abstractNumId="19" w15:restartNumberingAfterBreak="0">
     <w:nsid w:val="10FE267F"/>
     <w:multiLevelType w:val="multilevel"/>
     <w:tmpl w:val="0EE4C66A"/>
@@ -9118,7 +11265,7 @@
       </w:rPr>
     </w:lvl>
   </w:abstractNum>
-  <w:abstractNum w:abstractNumId="18" w15:restartNumberingAfterBreak="0">
+  <w:abstractNum w:abstractNumId="20" w15:restartNumberingAfterBreak="0">
     <w:nsid w:val="11E10733"/>
     <w:multiLevelType w:val="multilevel"/>
     <w:tmpl w:val="A0EA97D6"/>
@@ -9267,7 +11414,7 @@
       </w:rPr>
     </w:lvl>
   </w:abstractNum>
-  <w:abstractNum w:abstractNumId="19" w15:restartNumberingAfterBreak="0">
+  <w:abstractNum w:abstractNumId="21" w15:restartNumberingAfterBreak="0">
     <w:nsid w:val="12A9222F"/>
     <w:multiLevelType w:val="multilevel"/>
     <w:tmpl w:val="5D20054E"/>
@@ -9416,7 +11563,7 @@
       </w:rPr>
     </w:lvl>
   </w:abstractNum>
-  <w:abstractNum w:abstractNumId="20" w15:restartNumberingAfterBreak="0">
+  <w:abstractNum w:abstractNumId="22" w15:restartNumberingAfterBreak="0">
     <w:nsid w:val="192E4240"/>
     <w:multiLevelType w:val="multilevel"/>
     <w:tmpl w:val="AC42F726"/>
@@ -9565,7 +11712,7 @@
       </w:rPr>
     </w:lvl>
   </w:abstractNum>
-  <w:abstractNum w:abstractNumId="21" w15:restartNumberingAfterBreak="0">
+  <w:abstractNum w:abstractNumId="23" w15:restartNumberingAfterBreak="0">
     <w:nsid w:val="1E641A5B"/>
     <w:multiLevelType w:val="multilevel"/>
     <w:tmpl w:val="A5E02A98"/>
@@ -9714,7 +11861,7 @@
       </w:rPr>
     </w:lvl>
   </w:abstractNum>
-  <w:abstractNum w:abstractNumId="22" w15:restartNumberingAfterBreak="0">
+  <w:abstractNum w:abstractNumId="24" w15:restartNumberingAfterBreak="0">
     <w:nsid w:val="23AC319C"/>
     <w:multiLevelType w:val="multilevel"/>
     <w:tmpl w:val="F8046F12"/>
@@ -9863,7 +12010,7 @@
       </w:rPr>
     </w:lvl>
   </w:abstractNum>
-  <w:abstractNum w:abstractNumId="23" w15:restartNumberingAfterBreak="0">
+  <w:abstractNum w:abstractNumId="25" w15:restartNumberingAfterBreak="0">
     <w:nsid w:val="26182C48"/>
     <w:multiLevelType w:val="multilevel"/>
     <w:tmpl w:val="E1F038AA"/>
@@ -10012,7 +12159,7 @@
       </w:rPr>
     </w:lvl>
   </w:abstractNum>
-  <w:abstractNum w:abstractNumId="24" w15:restartNumberingAfterBreak="0">
+  <w:abstractNum w:abstractNumId="26" w15:restartNumberingAfterBreak="0">
     <w:nsid w:val="29863D86"/>
     <w:multiLevelType w:val="multilevel"/>
     <w:tmpl w:val="1E2C0856"/>
@@ -10161,7 +12308,7 @@
       </w:rPr>
     </w:lvl>
   </w:abstractNum>
-  <w:abstractNum w:abstractNumId="25" w15:restartNumberingAfterBreak="0">
+  <w:abstractNum w:abstractNumId="27" w15:restartNumberingAfterBreak="0">
     <w:nsid w:val="31F84236"/>
     <w:multiLevelType w:val="multilevel"/>
     <w:tmpl w:val="B0A6659E"/>
@@ -10310,7 +12457,7 @@
       </w:rPr>
     </w:lvl>
   </w:abstractNum>
-  <w:abstractNum w:abstractNumId="26" w15:restartNumberingAfterBreak="0">
+  <w:abstractNum w:abstractNumId="28" w15:restartNumberingAfterBreak="0">
     <w:nsid w:val="34E91199"/>
     <w:multiLevelType w:val="multilevel"/>
     <w:tmpl w:val="91B06FA2"/>
@@ -10459,7 +12606,7 @@
       </w:rPr>
     </w:lvl>
   </w:abstractNum>
-  <w:abstractNum w:abstractNumId="27" w15:restartNumberingAfterBreak="0">
+  <w:abstractNum w:abstractNumId="29" w15:restartNumberingAfterBreak="0">
     <w:nsid w:val="361F1304"/>
     <w:multiLevelType w:val="multilevel"/>
     <w:tmpl w:val="51B88348"/>
@@ -10608,7 +12755,7 @@
       </w:rPr>
     </w:lvl>
   </w:abstractNum>
-  <w:abstractNum w:abstractNumId="28" w15:restartNumberingAfterBreak="0">
+  <w:abstractNum w:abstractNumId="30" w15:restartNumberingAfterBreak="0">
     <w:nsid w:val="3A797F08"/>
     <w:multiLevelType w:val="multilevel"/>
     <w:tmpl w:val="71902D54"/>
@@ -10757,7 +12904,7 @@
       </w:rPr>
     </w:lvl>
   </w:abstractNum>
-  <w:abstractNum w:abstractNumId="29" w15:restartNumberingAfterBreak="0">
+  <w:abstractNum w:abstractNumId="31" w15:restartNumberingAfterBreak="0">
     <w:nsid w:val="3A825C0F"/>
     <w:multiLevelType w:val="multilevel"/>
     <w:tmpl w:val="0C3A5CA2"/>
@@ -10906,7 +13053,7 @@
       </w:rPr>
     </w:lvl>
   </w:abstractNum>
-  <w:abstractNum w:abstractNumId="30" w15:restartNumberingAfterBreak="0">
+  <w:abstractNum w:abstractNumId="32" w15:restartNumberingAfterBreak="0">
     <w:nsid w:val="3ADA6EB1"/>
     <w:multiLevelType w:val="multilevel"/>
     <w:tmpl w:val="A9B65FEC"/>
@@ -11055,7 +13202,7 @@
       </w:rPr>
     </w:lvl>
   </w:abstractNum>
-  <w:abstractNum w:abstractNumId="31" w15:restartNumberingAfterBreak="0">
+  <w:abstractNum w:abstractNumId="33" w15:restartNumberingAfterBreak="0">
     <w:nsid w:val="3BE90B73"/>
     <w:multiLevelType w:val="multilevel"/>
     <w:tmpl w:val="C3C85430"/>
@@ -11204,7 +13351,7 @@
       </w:rPr>
     </w:lvl>
   </w:abstractNum>
-  <w:abstractNum w:abstractNumId="32" w15:restartNumberingAfterBreak="0">
+  <w:abstractNum w:abstractNumId="34" w15:restartNumberingAfterBreak="0">
     <w:nsid w:val="3DDE3D83"/>
     <w:multiLevelType w:val="multilevel"/>
     <w:tmpl w:val="27F43A58"/>
@@ -11353,7 +13500,7 @@
       </w:rPr>
     </w:lvl>
   </w:abstractNum>
-  <w:abstractNum w:abstractNumId="33" w15:restartNumberingAfterBreak="0">
+  <w:abstractNum w:abstractNumId="35" w15:restartNumberingAfterBreak="0">
     <w:nsid w:val="40A54509"/>
     <w:multiLevelType w:val="multilevel"/>
     <w:tmpl w:val="6C6E5934"/>
@@ -11502,7 +13649,7 @@
       </w:rPr>
     </w:lvl>
   </w:abstractNum>
-  <w:abstractNum w:abstractNumId="34" w15:restartNumberingAfterBreak="0">
+  <w:abstractNum w:abstractNumId="36" w15:restartNumberingAfterBreak="0">
     <w:nsid w:val="4598084F"/>
     <w:multiLevelType w:val="multilevel"/>
     <w:tmpl w:val="DFC2A44A"/>
@@ -11651,7 +13798,7 @@
       </w:rPr>
     </w:lvl>
   </w:abstractNum>
-  <w:abstractNum w:abstractNumId="35" w15:restartNumberingAfterBreak="0">
+  <w:abstractNum w:abstractNumId="37" w15:restartNumberingAfterBreak="0">
     <w:nsid w:val="46601E25"/>
     <w:multiLevelType w:val="multilevel"/>
     <w:tmpl w:val="38AED190"/>
@@ -11800,7 +13947,7 @@
       </w:rPr>
     </w:lvl>
   </w:abstractNum>
-  <w:abstractNum w:abstractNumId="36" w15:restartNumberingAfterBreak="0">
+  <w:abstractNum w:abstractNumId="38" w15:restartNumberingAfterBreak="0">
     <w:nsid w:val="485B1020"/>
     <w:multiLevelType w:val="multilevel"/>
     <w:tmpl w:val="8264D2C2"/>
@@ -11949,7 +14096,7 @@
       </w:rPr>
     </w:lvl>
   </w:abstractNum>
-  <w:abstractNum w:abstractNumId="37" w15:restartNumberingAfterBreak="0">
+  <w:abstractNum w:abstractNumId="39" w15:restartNumberingAfterBreak="0">
     <w:nsid w:val="48BE5240"/>
     <w:multiLevelType w:val="multilevel"/>
     <w:tmpl w:val="6616BA3E"/>
@@ -12098,7 +14245,7 @@
       </w:rPr>
     </w:lvl>
   </w:abstractNum>
-  <w:abstractNum w:abstractNumId="38" w15:restartNumberingAfterBreak="0">
+  <w:abstractNum w:abstractNumId="40" w15:restartNumberingAfterBreak="0">
     <w:nsid w:val="500510D8"/>
     <w:multiLevelType w:val="multilevel"/>
     <w:tmpl w:val="BC7C8E5C"/>
@@ -12247,7 +14394,7 @@
       </w:rPr>
     </w:lvl>
   </w:abstractNum>
-  <w:abstractNum w:abstractNumId="39" w15:restartNumberingAfterBreak="0">
+  <w:abstractNum w:abstractNumId="41" w15:restartNumberingAfterBreak="0">
     <w:nsid w:val="536D4BE5"/>
     <w:multiLevelType w:val="multilevel"/>
     <w:tmpl w:val="CBB43494"/>
@@ -12396,7 +14543,7 @@
       </w:rPr>
     </w:lvl>
   </w:abstractNum>
-  <w:abstractNum w:abstractNumId="40" w15:restartNumberingAfterBreak="0">
+  <w:abstractNum w:abstractNumId="42" w15:restartNumberingAfterBreak="0">
     <w:nsid w:val="547B4D04"/>
     <w:multiLevelType w:val="multilevel"/>
     <w:tmpl w:val="9DECF1DC"/>
@@ -12545,7 +14692,7 @@
       </w:rPr>
     </w:lvl>
   </w:abstractNum>
-  <w:abstractNum w:abstractNumId="41" w15:restartNumberingAfterBreak="0">
+  <w:abstractNum w:abstractNumId="43" w15:restartNumberingAfterBreak="0">
     <w:nsid w:val="56FB10D3"/>
     <w:multiLevelType w:val="multilevel"/>
     <w:tmpl w:val="335000BE"/>
@@ -12694,7 +14841,7 @@
       </w:rPr>
     </w:lvl>
   </w:abstractNum>
-  <w:abstractNum w:abstractNumId="42" w15:restartNumberingAfterBreak="0">
+  <w:abstractNum w:abstractNumId="44" w15:restartNumberingAfterBreak="0">
     <w:nsid w:val="5C2243DE"/>
     <w:multiLevelType w:val="multilevel"/>
     <w:tmpl w:val="96F245A4"/>
@@ -12843,7 +14990,7 @@
       </w:rPr>
     </w:lvl>
   </w:abstractNum>
-  <w:abstractNum w:abstractNumId="43" w15:restartNumberingAfterBreak="0">
+  <w:abstractNum w:abstractNumId="45" w15:restartNumberingAfterBreak="0">
     <w:nsid w:val="5F0D4EE5"/>
     <w:multiLevelType w:val="multilevel"/>
     <w:tmpl w:val="BDE218BC"/>
@@ -12992,7 +15139,7 @@
       </w:rPr>
     </w:lvl>
   </w:abstractNum>
-  <w:abstractNum w:abstractNumId="44" w15:restartNumberingAfterBreak="0">
+  <w:abstractNum w:abstractNumId="46" w15:restartNumberingAfterBreak="0">
     <w:nsid w:val="5FCE3CBF"/>
     <w:multiLevelType w:val="multilevel"/>
     <w:tmpl w:val="4AA27DCC"/>
@@ -13141,7 +15288,7 @@
       </w:rPr>
     </w:lvl>
   </w:abstractNum>
-  <w:abstractNum w:abstractNumId="45" w15:restartNumberingAfterBreak="0">
+  <w:abstractNum w:abstractNumId="47" w15:restartNumberingAfterBreak="0">
     <w:nsid w:val="634922E6"/>
     <w:multiLevelType w:val="multilevel"/>
     <w:tmpl w:val="EF8C8264"/>
@@ -13290,7 +15437,7 @@
       </w:rPr>
     </w:lvl>
   </w:abstractNum>
-  <w:abstractNum w:abstractNumId="46" w15:restartNumberingAfterBreak="0">
+  <w:abstractNum w:abstractNumId="48" w15:restartNumberingAfterBreak="0">
     <w:nsid w:val="636D182D"/>
     <w:multiLevelType w:val="multilevel"/>
     <w:tmpl w:val="55168E92"/>
@@ -13439,7 +15586,7 @@
       </w:rPr>
     </w:lvl>
   </w:abstractNum>
-  <w:abstractNum w:abstractNumId="47" w15:restartNumberingAfterBreak="0">
+  <w:abstractNum w:abstractNumId="49" w15:restartNumberingAfterBreak="0">
     <w:nsid w:val="65831E4D"/>
     <w:multiLevelType w:val="multilevel"/>
     <w:tmpl w:val="32C408CC"/>
@@ -13588,7 +15735,7 @@
       </w:rPr>
     </w:lvl>
   </w:abstractNum>
-  <w:abstractNum w:abstractNumId="48" w15:restartNumberingAfterBreak="0">
+  <w:abstractNum w:abstractNumId="50" w15:restartNumberingAfterBreak="0">
     <w:nsid w:val="6BE16F3C"/>
     <w:multiLevelType w:val="multilevel"/>
     <w:tmpl w:val="3DA67BDC"/>
@@ -13737,7 +15884,7 @@
       </w:rPr>
     </w:lvl>
   </w:abstractNum>
-  <w:abstractNum w:abstractNumId="49" w15:restartNumberingAfterBreak="0">
+  <w:abstractNum w:abstractNumId="51" w15:restartNumberingAfterBreak="0">
     <w:nsid w:val="6C6956A9"/>
     <w:multiLevelType w:val="multilevel"/>
     <w:tmpl w:val="AC9A2AEA"/>
@@ -13886,7 +16033,7 @@
       </w:rPr>
     </w:lvl>
   </w:abstractNum>
-  <w:abstractNum w:abstractNumId="50" w15:restartNumberingAfterBreak="0">
+  <w:abstractNum w:abstractNumId="52" w15:restartNumberingAfterBreak="0">
     <w:nsid w:val="6D27441B"/>
     <w:multiLevelType w:val="multilevel"/>
     <w:tmpl w:val="194CF644"/>
@@ -14035,7 +16182,7 @@
       </w:rPr>
     </w:lvl>
   </w:abstractNum>
-  <w:abstractNum w:abstractNumId="51" w15:restartNumberingAfterBreak="0">
+  <w:abstractNum w:abstractNumId="53" w15:restartNumberingAfterBreak="0">
     <w:nsid w:val="6F6C42BE"/>
     <w:multiLevelType w:val="multilevel"/>
     <w:tmpl w:val="887EDE64"/>
@@ -14184,7 +16331,7 @@
       </w:rPr>
     </w:lvl>
   </w:abstractNum>
-  <w:abstractNum w:abstractNumId="52" w15:restartNumberingAfterBreak="0">
+  <w:abstractNum w:abstractNumId="54" w15:restartNumberingAfterBreak="0">
     <w:nsid w:val="70525485"/>
     <w:multiLevelType w:val="multilevel"/>
     <w:tmpl w:val="91FE36E2"/>
@@ -14333,7 +16480,7 @@
       </w:rPr>
     </w:lvl>
   </w:abstractNum>
-  <w:abstractNum w:abstractNumId="53" w15:restartNumberingAfterBreak="0">
+  <w:abstractNum w:abstractNumId="55" w15:restartNumberingAfterBreak="0">
     <w:nsid w:val="712A1F25"/>
     <w:multiLevelType w:val="multilevel"/>
     <w:tmpl w:val="158871CA"/>
@@ -14482,7 +16629,7 @@
       </w:rPr>
     </w:lvl>
   </w:abstractNum>
-  <w:abstractNum w:abstractNumId="54" w15:restartNumberingAfterBreak="0">
+  <w:abstractNum w:abstractNumId="56" w15:restartNumberingAfterBreak="0">
     <w:nsid w:val="7323674A"/>
     <w:multiLevelType w:val="multilevel"/>
     <w:tmpl w:val="A750407C"/>
@@ -14631,7 +16778,7 @@
       </w:rPr>
     </w:lvl>
   </w:abstractNum>
-  <w:abstractNum w:abstractNumId="55" w15:restartNumberingAfterBreak="0">
+  <w:abstractNum w:abstractNumId="57" w15:restartNumberingAfterBreak="0">
     <w:nsid w:val="79D71099"/>
     <w:multiLevelType w:val="multilevel"/>
     <w:tmpl w:val="D97CE34A"/>
@@ -14780,7 +16927,7 @@
       </w:rPr>
     </w:lvl>
   </w:abstractNum>
-  <w:abstractNum w:abstractNumId="56" w15:restartNumberingAfterBreak="0">
+  <w:abstractNum w:abstractNumId="58" w15:restartNumberingAfterBreak="0">
     <w:nsid w:val="7A1A08EF"/>
     <w:multiLevelType w:val="multilevel"/>
     <w:tmpl w:val="C7522C74"/>
@@ -14929,7 +17076,7 @@
       </w:rPr>
     </w:lvl>
   </w:abstractNum>
-  <w:abstractNum w:abstractNumId="57" w15:restartNumberingAfterBreak="0">
+  <w:abstractNum w:abstractNumId="59" w15:restartNumberingAfterBreak="0">
     <w:nsid w:val="7F4C6D3E"/>
     <w:multiLevelType w:val="multilevel"/>
     <w:tmpl w:val="5A14466E"/>
@@ -15079,178 +17226,184 @@
     </w:lvl>
   </w:abstractNum>
   <w:num w:numId="1" w16cid:durableId="881328805">
-    <w:abstractNumId w:val="16"/>
+    <w:abstractNumId w:val="18"/>
   </w:num>
   <w:num w:numId="2" w16cid:durableId="2128811772">
-    <w:abstractNumId w:val="25"/>
+    <w:abstractNumId w:val="27"/>
   </w:num>
   <w:num w:numId="3" w16cid:durableId="1834683327">
     <w:abstractNumId w:val="0"/>
   </w:num>
   <w:num w:numId="4" w16cid:durableId="1794326284">
-    <w:abstractNumId w:val="32"/>
+    <w:abstractNumId w:val="34"/>
   </w:num>
   <w:num w:numId="5" w16cid:durableId="1872569089">
-    <w:abstractNumId w:val="46"/>
+    <w:abstractNumId w:val="48"/>
   </w:num>
   <w:num w:numId="6" w16cid:durableId="521943461">
-    <w:abstractNumId w:val="23"/>
+    <w:abstractNumId w:val="25"/>
   </w:num>
   <w:num w:numId="7" w16cid:durableId="491872021">
-    <w:abstractNumId w:val="30"/>
+    <w:abstractNumId w:val="32"/>
   </w:num>
   <w:num w:numId="8" w16cid:durableId="681055839">
     <w:abstractNumId w:val="2"/>
   </w:num>
   <w:num w:numId="9" w16cid:durableId="1250037953">
-    <w:abstractNumId w:val="44"/>
+    <w:abstractNumId w:val="46"/>
   </w:num>
   <w:num w:numId="10" w16cid:durableId="1080054305">
-    <w:abstractNumId w:val="57"/>
+    <w:abstractNumId w:val="59"/>
   </w:num>
   <w:num w:numId="11" w16cid:durableId="772164310">
+    <w:abstractNumId w:val="14"/>
+  </w:num>
+  <w:num w:numId="12" w16cid:durableId="994184104">
+    <w:abstractNumId w:val="30"/>
+  </w:num>
+  <w:num w:numId="13" w16cid:durableId="1828328599">
+    <w:abstractNumId w:val="51"/>
+  </w:num>
+  <w:num w:numId="14" w16cid:durableId="1386488928">
     <w:abstractNumId w:val="12"/>
   </w:num>
-  <w:num w:numId="12" w16cid:durableId="994184104">
-    <w:abstractNumId w:val="28"/>
+  <w:num w:numId="15" w16cid:durableId="1220703042">
+    <w:abstractNumId w:val="23"/>
   </w:num>
-  <w:num w:numId="13" w16cid:durableId="1828328599">
-    <w:abstractNumId w:val="49"/>
-  </w:num>
-  <w:num w:numId="14" w16cid:durableId="1386488928">
+  <w:num w:numId="16" w16cid:durableId="117650344">
     <w:abstractNumId w:val="10"/>
   </w:num>
-  <w:num w:numId="15" w16cid:durableId="1220703042">
-    <w:abstractNumId w:val="21"/>
-  </w:num>
-  <w:num w:numId="16" w16cid:durableId="117650344">
-    <w:abstractNumId w:val="8"/>
-  </w:num>
   <w:num w:numId="17" w16cid:durableId="236742626">
-    <w:abstractNumId w:val="51"/>
+    <w:abstractNumId w:val="53"/>
   </w:num>
   <w:num w:numId="18" w16cid:durableId="947856463">
-    <w:abstractNumId w:val="18"/>
+    <w:abstractNumId w:val="20"/>
   </w:num>
   <w:num w:numId="19" w16cid:durableId="407265575">
-    <w:abstractNumId w:val="20"/>
+    <w:abstractNumId w:val="22"/>
   </w:num>
   <w:num w:numId="20" w16cid:durableId="1496341723">
-    <w:abstractNumId w:val="53"/>
+    <w:abstractNumId w:val="55"/>
   </w:num>
   <w:num w:numId="21" w16cid:durableId="2066490303">
     <w:abstractNumId w:val="6"/>
   </w:num>
   <w:num w:numId="22" w16cid:durableId="926424061">
-    <w:abstractNumId w:val="17"/>
+    <w:abstractNumId w:val="19"/>
   </w:num>
   <w:num w:numId="23" w16cid:durableId="37559950">
-    <w:abstractNumId w:val="48"/>
+    <w:abstractNumId w:val="50"/>
   </w:num>
   <w:num w:numId="24" w16cid:durableId="894046652">
+    <w:abstractNumId w:val="41"/>
+  </w:num>
+  <w:num w:numId="25" w16cid:durableId="701397943">
+    <w:abstractNumId w:val="11"/>
+  </w:num>
+  <w:num w:numId="26" w16cid:durableId="426074560">
+    <w:abstractNumId w:val="44"/>
+  </w:num>
+  <w:num w:numId="27" w16cid:durableId="530605129">
+    <w:abstractNumId w:val="36"/>
+  </w:num>
+  <w:num w:numId="28" w16cid:durableId="1792942499">
+    <w:abstractNumId w:val="16"/>
+  </w:num>
+  <w:num w:numId="29" w16cid:durableId="964846423">
+    <w:abstractNumId w:val="24"/>
+  </w:num>
+  <w:num w:numId="30" w16cid:durableId="1164199599">
     <w:abstractNumId w:val="39"/>
   </w:num>
-  <w:num w:numId="25" w16cid:durableId="701397943">
-    <w:abstractNumId w:val="9"/>
+  <w:num w:numId="31" w16cid:durableId="1994023068">
+    <w:abstractNumId w:val="54"/>
   </w:num>
-  <w:num w:numId="26" w16cid:durableId="426074560">
-    <w:abstractNumId w:val="42"/>
+  <w:num w:numId="32" w16cid:durableId="1183084766">
+    <w:abstractNumId w:val="15"/>
   </w:num>
-  <w:num w:numId="27" w16cid:durableId="530605129">
-    <w:abstractNumId w:val="34"/>
+  <w:num w:numId="33" w16cid:durableId="1994945427">
+    <w:abstractNumId w:val="40"/>
   </w:num>
-  <w:num w:numId="28" w16cid:durableId="1792942499">
-    <w:abstractNumId w:val="14"/>
+  <w:num w:numId="34" w16cid:durableId="2045707999">
+    <w:abstractNumId w:val="21"/>
   </w:num>
-  <w:num w:numId="29" w16cid:durableId="964846423">
-    <w:abstractNumId w:val="22"/>
+  <w:num w:numId="35" w16cid:durableId="455829178">
+    <w:abstractNumId w:val="33"/>
   </w:num>
-  <w:num w:numId="30" w16cid:durableId="1164199599">
+  <w:num w:numId="36" w16cid:durableId="1877038320">
+    <w:abstractNumId w:val="29"/>
+  </w:num>
+  <w:num w:numId="37" w16cid:durableId="301347051">
     <w:abstractNumId w:val="37"/>
   </w:num>
-  <w:num w:numId="31" w16cid:durableId="1994023068">
-    <w:abstractNumId w:val="52"/>
-  </w:num>
-  <w:num w:numId="32" w16cid:durableId="1183084766">
-    <w:abstractNumId w:val="13"/>
-  </w:num>
-  <w:num w:numId="33" w16cid:durableId="1994945427">
-    <w:abstractNumId w:val="38"/>
-  </w:num>
-  <w:num w:numId="34" w16cid:durableId="2045707999">
-    <w:abstractNumId w:val="19"/>
-  </w:num>
-  <w:num w:numId="35" w16cid:durableId="455829178">
-    <w:abstractNumId w:val="31"/>
-  </w:num>
-  <w:num w:numId="36" w16cid:durableId="1877038320">
-    <w:abstractNumId w:val="27"/>
-  </w:num>
-  <w:num w:numId="37" w16cid:durableId="301347051">
-    <w:abstractNumId w:val="35"/>
-  </w:num>
   <w:num w:numId="38" w16cid:durableId="328410090">
-    <w:abstractNumId w:val="43"/>
+    <w:abstractNumId w:val="45"/>
   </w:num>
   <w:num w:numId="39" w16cid:durableId="253631815">
     <w:abstractNumId w:val="3"/>
   </w:num>
   <w:num w:numId="40" w16cid:durableId="1648362721">
-    <w:abstractNumId w:val="45"/>
+    <w:abstractNumId w:val="47"/>
   </w:num>
   <w:num w:numId="41" w16cid:durableId="1507791949">
-    <w:abstractNumId w:val="41"/>
+    <w:abstractNumId w:val="43"/>
   </w:num>
   <w:num w:numId="42" w16cid:durableId="1995721347">
     <w:abstractNumId w:val="5"/>
   </w:num>
   <w:num w:numId="43" w16cid:durableId="579943954">
-    <w:abstractNumId w:val="40"/>
+    <w:abstractNumId w:val="42"/>
   </w:num>
   <w:num w:numId="44" w16cid:durableId="532815097">
-    <w:abstractNumId w:val="54"/>
+    <w:abstractNumId w:val="56"/>
   </w:num>
   <w:num w:numId="45" w16cid:durableId="346517292">
-    <w:abstractNumId w:val="26"/>
+    <w:abstractNumId w:val="28"/>
   </w:num>
   <w:num w:numId="46" w16cid:durableId="1764060115">
-    <w:abstractNumId w:val="36"/>
+    <w:abstractNumId w:val="38"/>
   </w:num>
   <w:num w:numId="47" w16cid:durableId="1071584300">
-    <w:abstractNumId w:val="33"/>
+    <w:abstractNumId w:val="35"/>
   </w:num>
   <w:num w:numId="48" w16cid:durableId="1421414698">
     <w:abstractNumId w:val="4"/>
   </w:num>
   <w:num w:numId="49" w16cid:durableId="408814244">
-    <w:abstractNumId w:val="24"/>
+    <w:abstractNumId w:val="26"/>
   </w:num>
   <w:num w:numId="50" w16cid:durableId="1675373206">
-    <w:abstractNumId w:val="56"/>
+    <w:abstractNumId w:val="58"/>
   </w:num>
   <w:num w:numId="51" w16cid:durableId="936448669">
-    <w:abstractNumId w:val="7"/>
+    <w:abstractNumId w:val="8"/>
   </w:num>
   <w:num w:numId="52" w16cid:durableId="261227078">
-    <w:abstractNumId w:val="29"/>
+    <w:abstractNumId w:val="31"/>
   </w:num>
   <w:num w:numId="53" w16cid:durableId="1848640251">
-    <w:abstractNumId w:val="47"/>
+    <w:abstractNumId w:val="49"/>
   </w:num>
   <w:num w:numId="54" w16cid:durableId="943150281">
-    <w:abstractNumId w:val="15"/>
+    <w:abstractNumId w:val="17"/>
   </w:num>
   <w:num w:numId="55" w16cid:durableId="94136030">
-    <w:abstractNumId w:val="55"/>
+    <w:abstractNumId w:val="57"/>
   </w:num>
   <w:num w:numId="56" w16cid:durableId="341323221">
-    <w:abstractNumId w:val="11"/>
+    <w:abstractNumId w:val="13"/>
   </w:num>
   <w:num w:numId="57" w16cid:durableId="334498728">
     <w:abstractNumId w:val="1"/>
   </w:num>
   <w:num w:numId="58" w16cid:durableId="125664121">
-    <w:abstractNumId w:val="50"/>
+    <w:abstractNumId w:val="52"/>
+  </w:num>
+  <w:num w:numId="59" w16cid:durableId="2144076049">
+    <w:abstractNumId w:val="7"/>
+  </w:num>
+  <w:num w:numId="60" w16cid:durableId="1672297963">
+    <w:abstractNumId w:val="9"/>
   </w:num>
 </w:numbering>
 </file>

</xml_diff>